<commit_message>
Front camera link updated in Report.
</commit_message>
<xml_diff>
--- a/Documents/Tablet Design Report.docx
+++ b/Documents/Tablet Design Report.docx
@@ -13,9 +13,9 @@
         <w:t>Tablet Design Report</w:t>
       </w:r>
     </w:p>
-    <w:bookmarkStart w:id="1" w:name="_q712gkprt8lw" w:colFirst="0" w:colLast="0" w:displacedByCustomXml="next"/>
+    <w:bookmarkStart w:id="1" w:name="_165xlof05yyj" w:colFirst="0" w:colLast="0" w:displacedByCustomXml="next"/>
     <w:bookmarkEnd w:id="1" w:displacedByCustomXml="next"/>
-    <w:bookmarkStart w:id="2" w:name="_165xlof05yyj" w:colFirst="0" w:colLast="0" w:displacedByCustomXml="next"/>
+    <w:bookmarkStart w:id="2" w:name="_q712gkprt8lw" w:colFirst="0" w:colLast="0" w:displacedByCustomXml="next"/>
     <w:bookmarkEnd w:id="2" w:displacedByCustomXml="next"/>
     <w:sdt>
       <w:sdtPr>
@@ -2134,7 +2134,23 @@
           <w:sz w:val="20"/>
           <w:szCs w:val="20"/>
         </w:rPr>
-        <w:t>This section is responsible for supplying DC power to the core of SoM. The ETA3451D2I-T IC is being used in this section to produce 1V output. ETA3451D2I-T is a high frequency synchronous Step-Down converter with up to 91% efficiency for low output voltage and a 3.5A Max output current limit.</w:t>
+        <w:t xml:space="preserve">This section is responsible for supplying DC power to the core of </w:t>
+      </w:r>
+      <w:proofErr w:type="spellStart"/>
+      <w:r>
+        <w:rPr>
+          <w:sz w:val="20"/>
+          <w:szCs w:val="20"/>
+        </w:rPr>
+        <w:t>SoM.</w:t>
+      </w:r>
+      <w:proofErr w:type="spellEnd"/>
+      <w:r>
+        <w:rPr>
+          <w:sz w:val="20"/>
+          <w:szCs w:val="20"/>
+        </w:rPr>
+        <w:t xml:space="preserve"> The ETA3451D2I-T IC is being used in this section to produce 1V output. ETA3451D2I-T is a high frequency synchronous Step-Down converter with up to 91% efficiency for low output voltage and a 3.5A Max output current limit.</w:t>
       </w:r>
       <w:r>
         <w:br/>
@@ -2226,24 +2242,14 @@
       <w:r>
         <w:t xml:space="preserve">Figure </w:t>
       </w:r>
-      <w:r>
-        <w:fldChar w:fldCharType="begin"/>
-      </w:r>
-      <w:r>
-        <w:instrText xml:space="preserve"> SEQ Figure \* ARABIC </w:instrText>
-      </w:r>
-      <w:r>
-        <w:fldChar w:fldCharType="separate"/>
-      </w:r>
-      <w:r>
-        <w:rPr>
-          <w:noProof/>
-        </w:rPr>
-        <w:t>1</w:t>
-      </w:r>
-      <w:r>
-        <w:fldChar w:fldCharType="end"/>
-      </w:r>
+      <w:fldSimple w:instr=" SEQ Figure \* ARABIC ">
+        <w:r>
+          <w:rPr>
+            <w:noProof/>
+          </w:rPr>
+          <w:t>1</w:t>
+        </w:r>
+      </w:fldSimple>
     </w:p>
     <w:p>
       <w:pPr>
@@ -2309,15 +2315,7 @@
           <w:sz w:val="20"/>
           <w:szCs w:val="20"/>
         </w:rPr>
-        <w:t>MP3221GJ-Z IC</w:t>
-      </w:r>
-      <w:r>
-        <w:rPr>
-          <w:bCs/>
-          <w:sz w:val="20"/>
-          <w:szCs w:val="20"/>
-        </w:rPr>
-        <w:t>:</w:t>
+        <w:t>MP3221GJ-Z IC:</w:t>
       </w:r>
       <w:r>
         <w:rPr>
@@ -2497,24 +2495,14 @@
       <w:r>
         <w:t xml:space="preserve">Figure </w:t>
       </w:r>
-      <w:r>
-        <w:fldChar w:fldCharType="begin"/>
-      </w:r>
-      <w:r>
-        <w:instrText xml:space="preserve"> SEQ Figure \* ARABIC </w:instrText>
-      </w:r>
-      <w:r>
-        <w:fldChar w:fldCharType="separate"/>
-      </w:r>
-      <w:r>
-        <w:rPr>
-          <w:noProof/>
-        </w:rPr>
-        <w:t>2</w:t>
-      </w:r>
-      <w:r>
-        <w:fldChar w:fldCharType="end"/>
-      </w:r>
+      <w:fldSimple w:instr=" SEQ Figure \* ARABIC ">
+        <w:r>
+          <w:rPr>
+            <w:noProof/>
+          </w:rPr>
+          <w:t>2</w:t>
+        </w:r>
+      </w:fldSimple>
     </w:p>
     <w:p>
       <w:pPr>
@@ -2580,14 +2568,7 @@
           <w:sz w:val="20"/>
           <w:szCs w:val="20"/>
         </w:rPr>
-        <w:t>S-1206B18-M3T1</w:t>
-      </w:r>
-      <w:r>
-        <w:rPr>
-          <w:sz w:val="20"/>
-          <w:szCs w:val="20"/>
-        </w:rPr>
-        <w:t xml:space="preserve">U: ultra-low current consumption and low dropout </w:t>
+        <w:t xml:space="preserve">S-1206B18-M3T1U: ultra-low current consumption and low dropout </w:t>
       </w:r>
       <w:r>
         <w:rPr>
@@ -2631,7 +2612,23 @@
           <w:sz w:val="20"/>
           <w:szCs w:val="20"/>
         </w:rPr>
-        <w:t xml:space="preserve">This section is designated to provide power to the RTC clock of the SoM. </w:t>
+        <w:t xml:space="preserve">This section is designated to provide power to the RTC clock of the </w:t>
+      </w:r>
+      <w:proofErr w:type="spellStart"/>
+      <w:r>
+        <w:rPr>
+          <w:sz w:val="20"/>
+          <w:szCs w:val="20"/>
+        </w:rPr>
+        <w:t>SoM.</w:t>
+      </w:r>
+      <w:proofErr w:type="spellEnd"/>
+      <w:r>
+        <w:rPr>
+          <w:sz w:val="20"/>
+          <w:szCs w:val="20"/>
+        </w:rPr>
+        <w:t xml:space="preserve"> </w:t>
       </w:r>
       <w:r>
         <w:rPr>
@@ -2762,24 +2759,14 @@
       <w:r>
         <w:t xml:space="preserve">Figure </w:t>
       </w:r>
-      <w:r>
-        <w:fldChar w:fldCharType="begin"/>
-      </w:r>
-      <w:r>
-        <w:instrText xml:space="preserve"> SEQ Figure \* ARABIC </w:instrText>
-      </w:r>
-      <w:r>
-        <w:fldChar w:fldCharType="separate"/>
-      </w:r>
-      <w:r>
-        <w:rPr>
-          <w:noProof/>
-        </w:rPr>
-        <w:t>3</w:t>
-      </w:r>
-      <w:r>
-        <w:fldChar w:fldCharType="end"/>
-      </w:r>
+      <w:fldSimple w:instr=" SEQ Figure \* ARABIC ">
+        <w:r>
+          <w:rPr>
+            <w:noProof/>
+          </w:rPr>
+          <w:t>3</w:t>
+        </w:r>
+      </w:fldSimple>
     </w:p>
     <w:p>
       <w:pPr>
@@ -2959,15 +2946,7 @@
           <w:bCs/>
           <w:u w:val="single"/>
         </w:rPr>
-        <w:t>Description</w:t>
-      </w:r>
-      <w:r>
-        <w:rPr>
-          <w:b/>
-          <w:bCs/>
-          <w:u w:val="single"/>
-        </w:rPr>
-        <w:t>:</w:t>
+        <w:t>Description:</w:t>
       </w:r>
     </w:p>
     <w:p>
@@ -3087,24 +3066,14 @@
       <w:r>
         <w:t xml:space="preserve">Figure </w:t>
       </w:r>
-      <w:r>
-        <w:fldChar w:fldCharType="begin"/>
-      </w:r>
-      <w:r>
-        <w:instrText xml:space="preserve"> SEQ Figure \* ARABIC </w:instrText>
-      </w:r>
-      <w:r>
-        <w:fldChar w:fldCharType="separate"/>
-      </w:r>
-      <w:r>
-        <w:rPr>
-          <w:noProof/>
-        </w:rPr>
-        <w:t>4</w:t>
-      </w:r>
-      <w:r>
-        <w:fldChar w:fldCharType="end"/>
-      </w:r>
+      <w:fldSimple w:instr=" SEQ Figure \* ARABIC ">
+        <w:r>
+          <w:rPr>
+            <w:noProof/>
+          </w:rPr>
+          <w:t>4</w:t>
+        </w:r>
+      </w:fldSimple>
     </w:p>
     <w:p>
       <w:pPr>
@@ -3250,7 +3219,23 @@
           <w:sz w:val="20"/>
           <w:szCs w:val="20"/>
         </w:rPr>
-        <w:t xml:space="preserve"> to SoM via</w:t>
+        <w:t xml:space="preserve"> to </w:t>
+      </w:r>
+      <w:proofErr w:type="spellStart"/>
+      <w:r>
+        <w:rPr>
+          <w:sz w:val="20"/>
+          <w:szCs w:val="20"/>
+        </w:rPr>
+        <w:t>SoM</w:t>
+      </w:r>
+      <w:proofErr w:type="spellEnd"/>
+      <w:r>
+        <w:rPr>
+          <w:sz w:val="20"/>
+          <w:szCs w:val="20"/>
+        </w:rPr>
+        <w:t xml:space="preserve"> via</w:t>
       </w:r>
       <w:r>
         <w:rPr>
@@ -3343,7 +3328,7 @@
       <w:pPr>
         <w:ind w:left="360"/>
       </w:pPr>
-      <w:hyperlink r:id="rId16" w:history="1">
+      <w:hyperlink r:id="rId16" w:anchor="Gf70UQKzT3QTy8h_Zp9odA/folder/O04ixZyI" w:history="1">
         <w:r>
           <w:rPr>
             <w:rStyle w:val="Hyperlink"/>
@@ -3417,24 +3402,14 @@
       <w:r>
         <w:t xml:space="preserve">Figure </w:t>
       </w:r>
-      <w:r>
-        <w:fldChar w:fldCharType="begin"/>
-      </w:r>
-      <w:r>
-        <w:instrText xml:space="preserve"> SEQ Figure \* ARABIC </w:instrText>
-      </w:r>
-      <w:r>
-        <w:fldChar w:fldCharType="separate"/>
-      </w:r>
-      <w:r>
-        <w:rPr>
-          <w:noProof/>
-        </w:rPr>
-        <w:t>5</w:t>
-      </w:r>
-      <w:r>
-        <w:fldChar w:fldCharType="end"/>
-      </w:r>
+      <w:fldSimple w:instr=" SEQ Figure \* ARABIC ">
+        <w:r>
+          <w:rPr>
+            <w:noProof/>
+          </w:rPr>
+          <w:t>5</w:t>
+        </w:r>
+      </w:fldSimple>
     </w:p>
     <w:p>
       <w:pPr>
@@ -3641,24 +3616,14 @@
       <w:r>
         <w:t xml:space="preserve">Figure </w:t>
       </w:r>
-      <w:r>
-        <w:fldChar w:fldCharType="begin"/>
-      </w:r>
-      <w:r>
-        <w:instrText xml:space="preserve"> SEQ Figure \* ARABIC </w:instrText>
-      </w:r>
-      <w:r>
-        <w:fldChar w:fldCharType="separate"/>
-      </w:r>
-      <w:r>
-        <w:rPr>
-          <w:noProof/>
-        </w:rPr>
-        <w:t>6</w:t>
-      </w:r>
-      <w:r>
-        <w:fldChar w:fldCharType="end"/>
-      </w:r>
+      <w:fldSimple w:instr=" SEQ Figure \* ARABIC ">
+        <w:r>
+          <w:rPr>
+            <w:noProof/>
+          </w:rPr>
+          <w:t>6</w:t>
+        </w:r>
+      </w:fldSimple>
     </w:p>
     <w:p>
       <w:pPr>
@@ -3723,34 +3688,34 @@
         </w:rPr>
         <w:t xml:space="preserve"> </w:t>
       </w:r>
-    </w:p>
-    <w:p>
-      <w:pPr>
-        <w:rPr>
-          <w:sz w:val="20"/>
-          <w:szCs w:val="20"/>
-        </w:rPr>
-      </w:pPr>
-      <w:r>
-        <w:rPr>
-          <w:sz w:val="20"/>
-          <w:szCs w:val="20"/>
-        </w:rPr>
-        <w:t>693043020611</w:t>
-      </w:r>
-      <w:r>
-        <w:rPr>
-          <w:sz w:val="20"/>
-          <w:szCs w:val="20"/>
-        </w:rPr>
-        <w:t xml:space="preserve">: </w:t>
-      </w:r>
-      <w:r>
-        <w:rPr>
-          <w:sz w:val="20"/>
-          <w:szCs w:val="20"/>
-        </w:rPr>
-        <w:t>6 Position Card Connector NANO SIM Surface Mount, Right Angle Gold</w:t>
+      <w:r>
+        <w:rPr>
+          <w:sz w:val="20"/>
+          <w:szCs w:val="20"/>
+        </w:rPr>
+        <w:t>multi-band TDD-LTE/FDD-LTE/WCDMA/GSM/GNSS SMT type modul</w:t>
+      </w:r>
+      <w:r>
+        <w:rPr>
+          <w:sz w:val="20"/>
+          <w:szCs w:val="20"/>
+        </w:rPr>
+        <w:t>e.</w:t>
+      </w:r>
+    </w:p>
+    <w:p>
+      <w:pPr>
+        <w:rPr>
+          <w:sz w:val="20"/>
+          <w:szCs w:val="20"/>
+        </w:rPr>
+      </w:pPr>
+      <w:r>
+        <w:rPr>
+          <w:sz w:val="20"/>
+          <w:szCs w:val="20"/>
+        </w:rPr>
+        <w:t>693043020611: 6 Position Card Connector NANO SIM Surface Mount, Right Angle Gold</w:t>
       </w:r>
     </w:p>
     <w:p>
@@ -3845,38 +3810,44 @@
       <w:r>
         <w:t xml:space="preserve">Figure </w:t>
       </w:r>
-      <w:r>
-        <w:fldChar w:fldCharType="begin"/>
-      </w:r>
-      <w:r>
-        <w:instrText xml:space="preserve"> SEQ Figure \* ARABIC </w:instrText>
-      </w:r>
-      <w:r>
-        <w:fldChar w:fldCharType="separate"/>
-      </w:r>
-      <w:r>
-        <w:rPr>
-          <w:noProof/>
-        </w:rPr>
-        <w:t>7</w:t>
-      </w:r>
-      <w:r>
-        <w:fldChar w:fldCharType="end"/>
-      </w:r>
-    </w:p>
-    <w:p>
-      <w:pPr>
-        <w:rPr>
-          <w:sz w:val="20"/>
-          <w:szCs w:val="20"/>
-        </w:rPr>
-      </w:pPr>
-      <w:r>
-        <w:rPr>
-          <w:sz w:val="20"/>
-          <w:szCs w:val="20"/>
-        </w:rPr>
-        <w:t>SIM7100 has a 1.8V I/O level. To match the I/O levels of SoM which operate at 3.3V, level shifters are being used to bridge signals between the two devices.</w:t>
+      <w:fldSimple w:instr=" SEQ Figure \* ARABIC ">
+        <w:r>
+          <w:rPr>
+            <w:noProof/>
+          </w:rPr>
+          <w:t>7</w:t>
+        </w:r>
+      </w:fldSimple>
+    </w:p>
+    <w:p>
+      <w:pPr>
+        <w:rPr>
+          <w:sz w:val="20"/>
+          <w:szCs w:val="20"/>
+        </w:rPr>
+      </w:pPr>
+      <w:r>
+        <w:rPr>
+          <w:sz w:val="20"/>
+          <w:szCs w:val="20"/>
+        </w:rPr>
+        <w:t xml:space="preserve">SIM7100 has a 1.8V I/O level. To match the I/O levels of </w:t>
+      </w:r>
+      <w:proofErr w:type="spellStart"/>
+      <w:r>
+        <w:rPr>
+          <w:sz w:val="20"/>
+          <w:szCs w:val="20"/>
+        </w:rPr>
+        <w:t>SoM</w:t>
+      </w:r>
+      <w:proofErr w:type="spellEnd"/>
+      <w:r>
+        <w:rPr>
+          <w:sz w:val="20"/>
+          <w:szCs w:val="20"/>
+        </w:rPr>
+        <w:t xml:space="preserve"> which operate at 3.3V, level shifters are being used to bridge signals between the two devices.</w:t>
       </w:r>
     </w:p>
     <w:p>
@@ -3941,24 +3912,14 @@
       <w:r>
         <w:t xml:space="preserve">Figure </w:t>
       </w:r>
-      <w:r>
-        <w:fldChar w:fldCharType="begin"/>
-      </w:r>
-      <w:r>
-        <w:instrText xml:space="preserve"> SEQ Figure \* ARABIC </w:instrText>
-      </w:r>
-      <w:r>
-        <w:fldChar w:fldCharType="separate"/>
-      </w:r>
-      <w:r>
-        <w:rPr>
-          <w:noProof/>
-        </w:rPr>
-        <w:t>8</w:t>
-      </w:r>
-      <w:r>
-        <w:fldChar w:fldCharType="end"/>
-      </w:r>
+      <w:fldSimple w:instr=" SEQ Figure \* ARABIC ">
+        <w:r>
+          <w:rPr>
+            <w:noProof/>
+          </w:rPr>
+          <w:t>8</w:t>
+        </w:r>
+      </w:fldSimple>
     </w:p>
     <w:p>
       <w:pPr>
@@ -4034,24 +3995,14 @@
       <w:r>
         <w:t xml:space="preserve">Figure </w:t>
       </w:r>
-      <w:r>
-        <w:fldChar w:fldCharType="begin"/>
-      </w:r>
-      <w:r>
-        <w:instrText xml:space="preserve"> SEQ Figure \* ARABIC </w:instrText>
-      </w:r>
-      <w:r>
-        <w:fldChar w:fldCharType="separate"/>
-      </w:r>
-      <w:r>
-        <w:rPr>
-          <w:noProof/>
-        </w:rPr>
-        <w:t>9</w:t>
-      </w:r>
-      <w:r>
-        <w:fldChar w:fldCharType="end"/>
-      </w:r>
+      <w:fldSimple w:instr=" SEQ Figure \* ARABIC ">
+        <w:r>
+          <w:rPr>
+            <w:noProof/>
+          </w:rPr>
+          <w:t>9</w:t>
+        </w:r>
+      </w:fldSimple>
     </w:p>
     <w:p>
       <w:pPr>
@@ -4157,38 +4108,44 @@
       <w:r>
         <w:t xml:space="preserve">Figure </w:t>
       </w:r>
-      <w:r>
-        <w:fldChar w:fldCharType="begin"/>
-      </w:r>
-      <w:r>
-        <w:instrText xml:space="preserve"> SEQ Figure \* ARABIC </w:instrText>
-      </w:r>
-      <w:r>
-        <w:fldChar w:fldCharType="separate"/>
-      </w:r>
-      <w:r>
-        <w:rPr>
-          <w:noProof/>
-        </w:rPr>
-        <w:t>10</w:t>
-      </w:r>
-      <w:r>
-        <w:fldChar w:fldCharType="end"/>
-      </w:r>
-    </w:p>
-    <w:p>
-      <w:pPr>
-        <w:rPr>
-          <w:sz w:val="20"/>
-          <w:szCs w:val="20"/>
-        </w:rPr>
-      </w:pPr>
-      <w:r>
-        <w:rPr>
-          <w:sz w:val="20"/>
-          <w:szCs w:val="20"/>
-        </w:rPr>
-        <w:t>The SIM7100 module is communicating with the G4418 SoM via USB interface. The SIM7100 contains a USB interface compliant with the USB2.0 specification as a peripheral, but the USB charging function is not supported. The connections are made with proper ESD protection diodes.</w:t>
+      <w:fldSimple w:instr=" SEQ Figure \* ARABIC ">
+        <w:r>
+          <w:rPr>
+            <w:noProof/>
+          </w:rPr>
+          <w:t>10</w:t>
+        </w:r>
+      </w:fldSimple>
+    </w:p>
+    <w:p>
+      <w:pPr>
+        <w:rPr>
+          <w:sz w:val="20"/>
+          <w:szCs w:val="20"/>
+        </w:rPr>
+      </w:pPr>
+      <w:r>
+        <w:rPr>
+          <w:sz w:val="20"/>
+          <w:szCs w:val="20"/>
+        </w:rPr>
+        <w:t xml:space="preserve">The SIM7100 module is communicating with the G4418 </w:t>
+      </w:r>
+      <w:proofErr w:type="spellStart"/>
+      <w:r>
+        <w:rPr>
+          <w:sz w:val="20"/>
+          <w:szCs w:val="20"/>
+        </w:rPr>
+        <w:t>SoM</w:t>
+      </w:r>
+      <w:proofErr w:type="spellEnd"/>
+      <w:r>
+        <w:rPr>
+          <w:sz w:val="20"/>
+          <w:szCs w:val="20"/>
+        </w:rPr>
+        <w:t xml:space="preserve"> via USB interface. The SIM7100 contains a USB interface compliant with the USB2.0 specification as a peripheral, but the USB charging function is not supported. The connections are made with proper ESD protection diodes.</w:t>
       </w:r>
     </w:p>
     <w:p>
@@ -4250,24 +4207,14 @@
       <w:r>
         <w:t xml:space="preserve">Figure </w:t>
       </w:r>
-      <w:r>
-        <w:fldChar w:fldCharType="begin"/>
-      </w:r>
-      <w:r>
-        <w:instrText xml:space="preserve"> SEQ Figure \* ARABIC </w:instrText>
-      </w:r>
-      <w:r>
-        <w:fldChar w:fldCharType="separate"/>
-      </w:r>
-      <w:r>
-        <w:rPr>
-          <w:noProof/>
-        </w:rPr>
-        <w:t>11</w:t>
-      </w:r>
-      <w:r>
-        <w:fldChar w:fldCharType="end"/>
-      </w:r>
+      <w:fldSimple w:instr=" SEQ Figure \* ARABIC ">
+        <w:r>
+          <w:rPr>
+            <w:noProof/>
+          </w:rPr>
+          <w:t>11</w:t>
+        </w:r>
+      </w:fldSimple>
     </w:p>
     <w:p>
       <w:pPr>
@@ -4329,24 +4276,14 @@
       <w:r>
         <w:t xml:space="preserve">Figure </w:t>
       </w:r>
-      <w:r>
-        <w:fldChar w:fldCharType="begin"/>
-      </w:r>
-      <w:r>
-        <w:instrText xml:space="preserve"> SEQ Figure \* ARABIC </w:instrText>
-      </w:r>
-      <w:r>
-        <w:fldChar w:fldCharType="separate"/>
-      </w:r>
-      <w:r>
-        <w:rPr>
-          <w:noProof/>
-        </w:rPr>
-        <w:t>12</w:t>
-      </w:r>
-      <w:r>
-        <w:fldChar w:fldCharType="end"/>
-      </w:r>
+      <w:fldSimple w:instr=" SEQ Figure \* ARABIC ">
+        <w:r>
+          <w:rPr>
+            <w:noProof/>
+          </w:rPr>
+          <w:t>12</w:t>
+        </w:r>
+      </w:fldSimple>
     </w:p>
     <w:p>
       <w:pPr>
@@ -4371,19 +4308,7 @@
           <w:rPr>
             <w:rStyle w:val="Hyperlink"/>
           </w:rPr>
-          <w:t>https://www.we-online.de/katalog/datasheet/6930</w:t>
-        </w:r>
-        <w:r>
-          <w:rPr>
-            <w:rStyle w:val="Hyperlink"/>
-          </w:rPr>
-          <w:t>4</w:t>
-        </w:r>
-        <w:r>
-          <w:rPr>
-            <w:rStyle w:val="Hyperlink"/>
-          </w:rPr>
-          <w:t>3020611.pdf</w:t>
+          <w:t>https://www.we-online.de/katalog/datasheet/693043020611.pdf</w:t>
         </w:r>
       </w:hyperlink>
     </w:p>
@@ -4442,15 +4367,17 @@
           <w:szCs w:val="20"/>
         </w:rPr>
         <w:br/>
-        <w:t xml:space="preserve">We are using X4418 module in this tablet which consists of </w:t>
-      </w:r>
-      <w:r>
-        <w:rPr>
-          <w:sz w:val="20"/>
-          <w:szCs w:val="20"/>
-        </w:rPr>
-        <w:t>S5P4418 SoM</w:t>
-      </w:r>
+        <w:t xml:space="preserve">We are using X4418 module in this tablet which consists of S5P4418 </w:t>
+      </w:r>
+      <w:proofErr w:type="spellStart"/>
+      <w:r>
+        <w:rPr>
+          <w:sz w:val="20"/>
+          <w:szCs w:val="20"/>
+        </w:rPr>
+        <w:t>SoM</w:t>
+      </w:r>
+      <w:proofErr w:type="spellEnd"/>
       <w:r>
         <w:rPr>
           <w:sz w:val="20"/>
@@ -4477,7 +4404,21 @@
         <w:rPr>
           <w:color w:val="0000FF"/>
         </w:rPr>
-        <w:t>Overview of S5P4418 SoM:</w:t>
+        <w:t xml:space="preserve">Overview of S5P4418 </w:t>
+      </w:r>
+      <w:proofErr w:type="spellStart"/>
+      <w:r>
+        <w:rPr>
+          <w:color w:val="0000FF"/>
+        </w:rPr>
+        <w:t>SoM</w:t>
+      </w:r>
+      <w:proofErr w:type="spellEnd"/>
+      <w:r>
+        <w:rPr>
+          <w:color w:val="0000FF"/>
+        </w:rPr>
+        <w:t>:</w:t>
       </w:r>
       <w:bookmarkEnd w:id="23"/>
     </w:p>
@@ -4486,9 +4427,6 @@
         <w:ind w:left="360"/>
       </w:pPr>
       <w:r>
-        <w:br/>
-      </w:r>
-      <w:r>
         <w:rPr>
           <w:sz w:val="20"/>
           <w:szCs w:val="20"/>
@@ -4539,7 +4477,23 @@
           <w:sz w:val="20"/>
           <w:szCs w:val="20"/>
         </w:rPr>
-        <w:t xml:space="preserve">. The SoM is </w:t>
+        <w:t xml:space="preserve">. The </w:t>
+      </w:r>
+      <w:proofErr w:type="spellStart"/>
+      <w:r>
+        <w:rPr>
+          <w:sz w:val="20"/>
+          <w:szCs w:val="20"/>
+        </w:rPr>
+        <w:t>SoM</w:t>
+      </w:r>
+      <w:proofErr w:type="spellEnd"/>
+      <w:r>
+        <w:rPr>
+          <w:sz w:val="20"/>
+          <w:szCs w:val="20"/>
+        </w:rPr>
+        <w:t xml:space="preserve"> is </w:t>
       </w:r>
       <w:r>
         <w:rPr>
@@ -4970,16 +4924,7 @@
                 <w:szCs w:val="23"/>
                 <w:highlight w:val="white"/>
               </w:rPr>
-              <w:t xml:space="preserve">4, VC1, VP8, Theora, AVS, RV8/9/10, </w:t>
-            </w:r>
-            <w:r>
-              <w:rPr>
-                <w:sz w:val="23"/>
-                <w:szCs w:val="23"/>
-                <w:highlight w:val="white"/>
-              </w:rPr>
-              <w:lastRenderedPageBreak/>
-              <w:t>MJPEG</w:t>
+              <w:t>4, VC1, VP8, Theora, AVS, RV8/9/10, MJPEG</w:t>
             </w:r>
           </w:p>
         </w:tc>
@@ -5351,7 +5296,23 @@
           <w:sz w:val="20"/>
           <w:szCs w:val="20"/>
         </w:rPr>
-        <w:t>The module supports Dual Display up to 2048x1280, TFT-LCD, LVDS, HDMI 1.4a, MIPI-DSI output. It also provides a 3.3V output voltage at it's GPIOs which is quite commonly used among other integrated devices. Hence the device can be interfaced with a wide range of other chips sets. The Samsung S5P4418 has various boot modes including External Static Memory Boot, SPI Flash/EEPROM, NOR, USB and UART boot options.</w:t>
+        <w:t xml:space="preserve">The module supports Dual Display up to 2048x1280, TFT-LCD, LVDS, HDMI 1.4a, MIPI-DSI output. It also provides a 3.3V output voltage at </w:t>
+      </w:r>
+      <w:proofErr w:type="spellStart"/>
+      <w:r>
+        <w:rPr>
+          <w:sz w:val="20"/>
+          <w:szCs w:val="20"/>
+        </w:rPr>
+        <w:t>it's</w:t>
+      </w:r>
+      <w:proofErr w:type="spellEnd"/>
+      <w:r>
+        <w:rPr>
+          <w:sz w:val="20"/>
+          <w:szCs w:val="20"/>
+        </w:rPr>
+        <w:t xml:space="preserve"> GPIOs which is quite commonly used among other integrated devices. Hence the device can be interfaced with a wide range of other chips sets. The Samsung S5P4418 has various boot modes including External Static Memory Boot, SPI Flash/EEPROM, NOR, USB and UART boot options.</w:t>
       </w:r>
     </w:p>
     <w:p>
@@ -6192,79 +6153,94 @@
       <w:bookmarkStart w:id="32" w:name="_5uu9fxrf1exa" w:colFirst="0" w:colLast="0"/>
       <w:bookmarkStart w:id="33" w:name="_Toc78905930"/>
       <w:bookmarkEnd w:id="32"/>
+      <w:proofErr w:type="spellStart"/>
       <w:r>
         <w:rPr>
           <w:color w:val="0000FF"/>
         </w:rPr>
+        <w:t>SoM</w:t>
+      </w:r>
+      <w:proofErr w:type="spellEnd"/>
+      <w:r>
+        <w:rPr>
+          <w:color w:val="0000FF"/>
+        </w:rPr>
+        <w:t xml:space="preserve"> Power Section:</w:t>
+      </w:r>
+      <w:bookmarkEnd w:id="33"/>
+    </w:p>
+    <w:p>
+      <w:pPr>
+        <w:ind w:left="360"/>
+        <w:rPr>
+          <w:b/>
+          <w:sz w:val="20"/>
+          <w:szCs w:val="20"/>
+        </w:rPr>
+      </w:pPr>
+      <w:r>
+        <w:rPr>
+          <w:sz w:val="20"/>
+          <w:szCs w:val="20"/>
+        </w:rPr>
+        <w:t xml:space="preserve">The G44418 module uses AXP228 PMIC optimized for a multi-core high-performance system. It is designed to charge a </w:t>
+      </w:r>
+      <w:r>
+        <w:rPr>
+          <w:sz w:val="20"/>
+          <w:szCs w:val="20"/>
+        </w:rPr>
+        <w:t xml:space="preserve">single </w:t>
+      </w:r>
+      <w:r>
+        <w:rPr>
+          <w:sz w:val="20"/>
+          <w:szCs w:val="20"/>
+        </w:rPr>
+        <w:t>cell Li</w:t>
+      </w:r>
+      <w:r>
+        <w:rPr>
+          <w:sz w:val="20"/>
+          <w:szCs w:val="20"/>
+        </w:rPr>
+        <w:t>-</w:t>
+      </w:r>
+      <w:r>
+        <w:rPr>
+          <w:sz w:val="20"/>
+          <w:szCs w:val="20"/>
+        </w:rPr>
+        <w:t>battery (</w:t>
+      </w:r>
+      <w:r>
+        <w:rPr>
+          <w:sz w:val="20"/>
+          <w:szCs w:val="20"/>
+        </w:rPr>
+        <w:t>Li-</w:t>
+      </w:r>
+      <w:r>
+        <w:rPr>
+          <w:sz w:val="20"/>
+          <w:szCs w:val="20"/>
+        </w:rPr>
+        <w:t>ion or Li</w:t>
+      </w:r>
+      <w:r>
+        <w:rPr>
+          <w:sz w:val="20"/>
+          <w:szCs w:val="20"/>
+        </w:rPr>
+        <w:t>-polymer) application that requires multi-</w:t>
+      </w:r>
+      <w:r>
+        <w:rPr>
+          <w:sz w:val="20"/>
+          <w:szCs w:val="20"/>
+        </w:rPr>
         <w:lastRenderedPageBreak/>
-        <w:t>SoM Power Section:</w:t>
-      </w:r>
-      <w:bookmarkEnd w:id="33"/>
-    </w:p>
-    <w:p>
-      <w:pPr>
-        <w:ind w:left="360"/>
-        <w:rPr>
-          <w:b/>
-          <w:sz w:val="20"/>
-          <w:szCs w:val="20"/>
-        </w:rPr>
-      </w:pPr>
-      <w:r>
-        <w:rPr>
-          <w:sz w:val="20"/>
-          <w:szCs w:val="20"/>
-        </w:rPr>
-        <w:t xml:space="preserve">The G44418 module uses AXP228 PMIC optimized for a multi-core high-performance system. It is designed to charge a </w:t>
-      </w:r>
-      <w:r>
-        <w:rPr>
-          <w:sz w:val="20"/>
-          <w:szCs w:val="20"/>
-        </w:rPr>
-        <w:t xml:space="preserve">single </w:t>
-      </w:r>
-      <w:r>
-        <w:rPr>
-          <w:sz w:val="20"/>
-          <w:szCs w:val="20"/>
-        </w:rPr>
-        <w:t>cell Li</w:t>
-      </w:r>
-      <w:r>
-        <w:rPr>
-          <w:sz w:val="20"/>
-          <w:szCs w:val="20"/>
-        </w:rPr>
-        <w:t>-</w:t>
-      </w:r>
-      <w:r>
-        <w:rPr>
-          <w:sz w:val="20"/>
-          <w:szCs w:val="20"/>
-        </w:rPr>
-        <w:t>battery (</w:t>
-      </w:r>
-      <w:r>
-        <w:rPr>
-          <w:sz w:val="20"/>
-          <w:szCs w:val="20"/>
-        </w:rPr>
-        <w:t>Li-</w:t>
-      </w:r>
-      <w:r>
-        <w:rPr>
-          <w:sz w:val="20"/>
-          <w:szCs w:val="20"/>
-        </w:rPr>
-        <w:t>ion or Li</w:t>
-      </w:r>
-      <w:r>
-        <w:rPr>
-          <w:sz w:val="20"/>
-          <w:szCs w:val="20"/>
-        </w:rPr>
-        <w:t>-polymer) application that requires multi-channel power conversion outputs. AXP</w:t>
+        <w:t>channel power conversion outputs. AXP</w:t>
       </w:r>
       <w:r>
         <w:rPr>
@@ -6658,7 +6634,23 @@
           <w:sz w:val="20"/>
           <w:szCs w:val="20"/>
         </w:rPr>
-        <w:t xml:space="preserve"> to the SoM camera input </w:t>
+        <w:t xml:space="preserve"> to the </w:t>
+      </w:r>
+      <w:proofErr w:type="spellStart"/>
+      <w:r>
+        <w:rPr>
+          <w:sz w:val="20"/>
+          <w:szCs w:val="20"/>
+        </w:rPr>
+        <w:t>SoM</w:t>
+      </w:r>
+      <w:proofErr w:type="spellEnd"/>
+      <w:r>
+        <w:rPr>
+          <w:sz w:val="20"/>
+          <w:szCs w:val="20"/>
+        </w:rPr>
+        <w:t xml:space="preserve"> camera input </w:t>
       </w:r>
       <w:r>
         <w:rPr>
@@ -6782,24 +6774,14 @@
       <w:r>
         <w:t xml:space="preserve">Figure </w:t>
       </w:r>
-      <w:r>
-        <w:fldChar w:fldCharType="begin"/>
-      </w:r>
-      <w:r>
-        <w:instrText xml:space="preserve"> SEQ Figure \* ARABIC </w:instrText>
-      </w:r>
-      <w:r>
-        <w:fldChar w:fldCharType="separate"/>
-      </w:r>
-      <w:r>
-        <w:rPr>
-          <w:noProof/>
-        </w:rPr>
-        <w:t>13</w:t>
-      </w:r>
-      <w:r>
-        <w:fldChar w:fldCharType="end"/>
-      </w:r>
+      <w:fldSimple w:instr=" SEQ Figure \* ARABIC ">
+        <w:r>
+          <w:rPr>
+            <w:noProof/>
+          </w:rPr>
+          <w:t>13</w:t>
+        </w:r>
+      </w:fldSimple>
     </w:p>
     <w:p>
       <w:pPr>
@@ -6917,25 +6899,22 @@
         </w:rPr>
         <w:t xml:space="preserve">Link 2: </w:t>
       </w:r>
-      <w:hyperlink r:id="rId31">
+      <w:hyperlink r:id="rId31" w:history="1">
         <w:r>
           <w:rPr>
-            <w:color w:val="1155CC"/>
+            <w:rStyle w:val="Hyperlink"/>
             <w:sz w:val="20"/>
             <w:szCs w:val="20"/>
-            <w:highlight w:val="white"/>
-            <w:u w:val="single"/>
           </w:rPr>
-          <w:t>https://www.aliexpress.com/item/1005001683424081.html?spm=a2g0o.search0302.0.0.80883e01elPlrX&amp;algo_pvid=null&amp;algo_expid=null&amp;btsid=0bb0624416215274791093641e9154&amp;ws_ab_test=searchweb0_0,searchweb201602_,searchweb201603_</w:t>
+          <w:t>https://www.aliexpress.com/item/32843271086.html?spm=a2g0o.productlist.0.0.379c52c4Vo1wpF&amp;algo_pvid=82b36808-59b2-43d7-aa42-39c60dc5895f&amp;algo_exp_id=82b36808-59b2-43d7-aa42-39c60dc5895f-1</w:t>
         </w:r>
       </w:hyperlink>
       <w:r>
         <w:rPr>
           <w:sz w:val="20"/>
           <w:szCs w:val="20"/>
-          <w:highlight w:val="white"/>
-        </w:rPr>
-        <w:t xml:space="preserve"> (front)</w:t>
+        </w:rPr>
+        <w:t xml:space="preserve"> (Front)</w:t>
       </w:r>
     </w:p>
     <w:p>
@@ -7048,7 +7027,39 @@
           <w:sz w:val="20"/>
           <w:szCs w:val="20"/>
         </w:rPr>
-        <w:t xml:space="preserve"> is attached as an LCD matting connector. All pins are connected to the SoM. The SoM also supports the LVDS interface for LCDs. Depending on the selection of LCD, a dedicated backlight driver might be required.</w:t>
+        <w:t xml:space="preserve"> is attached as an LCD matting connector. All pins are connected to the </w:t>
+      </w:r>
+      <w:proofErr w:type="spellStart"/>
+      <w:r>
+        <w:rPr>
+          <w:sz w:val="20"/>
+          <w:szCs w:val="20"/>
+        </w:rPr>
+        <w:t>SoM.</w:t>
+      </w:r>
+      <w:proofErr w:type="spellEnd"/>
+      <w:r>
+        <w:rPr>
+          <w:sz w:val="20"/>
+          <w:szCs w:val="20"/>
+        </w:rPr>
+        <w:t xml:space="preserve"> The </w:t>
+      </w:r>
+      <w:proofErr w:type="spellStart"/>
+      <w:r>
+        <w:rPr>
+          <w:sz w:val="20"/>
+          <w:szCs w:val="20"/>
+        </w:rPr>
+        <w:t>SoM</w:t>
+      </w:r>
+      <w:proofErr w:type="spellEnd"/>
+      <w:r>
+        <w:rPr>
+          <w:sz w:val="20"/>
+          <w:szCs w:val="20"/>
+        </w:rPr>
+        <w:t xml:space="preserve"> also supports the LVDS interface for LCDs. Depending on the selection of LCD, a dedicated backlight driver might be required.</w:t>
       </w:r>
     </w:p>
     <w:p>
@@ -7111,24 +7122,14 @@
       <w:r>
         <w:t xml:space="preserve">Figure </w:t>
       </w:r>
-      <w:r>
-        <w:fldChar w:fldCharType="begin"/>
-      </w:r>
-      <w:r>
-        <w:instrText xml:space="preserve"> SEQ Figure \* ARABIC </w:instrText>
-      </w:r>
-      <w:r>
-        <w:fldChar w:fldCharType="separate"/>
-      </w:r>
-      <w:r>
-        <w:rPr>
-          <w:noProof/>
-        </w:rPr>
-        <w:t>14</w:t>
-      </w:r>
-      <w:r>
-        <w:fldChar w:fldCharType="end"/>
-      </w:r>
+      <w:fldSimple w:instr=" SEQ Figure \* ARABIC ">
+        <w:r>
+          <w:rPr>
+            <w:noProof/>
+          </w:rPr>
+          <w:t>14</w:t>
+        </w:r>
+      </w:fldSimple>
     </w:p>
     <w:p>
       <w:pPr>
@@ -7380,7 +7381,21 @@
           <w:sz w:val="20"/>
           <w:szCs w:val="20"/>
         </w:rPr>
-        <w:t xml:space="preserve">The memory section encompasses two SD card connectors </w:t>
+        <w:t xml:space="preserve">The memory section encompasses </w:t>
+      </w:r>
+      <w:r>
+        <w:rPr>
+          <w:sz w:val="20"/>
+          <w:szCs w:val="20"/>
+        </w:rPr>
+        <w:t>two</w:t>
+      </w:r>
+      <w:r>
+        <w:rPr>
+          <w:sz w:val="20"/>
+          <w:szCs w:val="20"/>
+        </w:rPr>
+        <w:t xml:space="preserve"> SD card connectors </w:t>
       </w:r>
       <w:r>
         <w:rPr>
@@ -7395,7 +7410,39 @@
           <w:sz w:val="20"/>
           <w:szCs w:val="20"/>
         </w:rPr>
-        <w:t xml:space="preserve"> which will be connected to the relevant pins of G4418 SoM. The connectors are powered through the 3.3V supply provided by the power section of the SoM. All data signals of the SD card are pulled up using a 47K resistor array.</w:t>
+        <w:t xml:space="preserve"> which will be connected to the relevant pins of G4418 </w:t>
+      </w:r>
+      <w:proofErr w:type="spellStart"/>
+      <w:r>
+        <w:rPr>
+          <w:sz w:val="20"/>
+          <w:szCs w:val="20"/>
+        </w:rPr>
+        <w:t>SoM.</w:t>
+      </w:r>
+      <w:proofErr w:type="spellEnd"/>
+      <w:r>
+        <w:rPr>
+          <w:sz w:val="20"/>
+          <w:szCs w:val="20"/>
+        </w:rPr>
+        <w:t xml:space="preserve"> The connectors are powered through the 3.3V supply provided by the power section of the </w:t>
+      </w:r>
+      <w:proofErr w:type="spellStart"/>
+      <w:r>
+        <w:rPr>
+          <w:sz w:val="20"/>
+          <w:szCs w:val="20"/>
+        </w:rPr>
+        <w:t>SoM.</w:t>
+      </w:r>
+      <w:proofErr w:type="spellEnd"/>
+      <w:r>
+        <w:rPr>
+          <w:sz w:val="20"/>
+          <w:szCs w:val="20"/>
+        </w:rPr>
+        <w:t xml:space="preserve"> All data signals of the SD card are pulled up using a 47K resistor array.</w:t>
       </w:r>
     </w:p>
     <w:p>
@@ -7457,24 +7504,14 @@
       <w:r>
         <w:t xml:space="preserve">Figure </w:t>
       </w:r>
-      <w:r>
-        <w:fldChar w:fldCharType="begin"/>
-      </w:r>
-      <w:r>
-        <w:instrText xml:space="preserve"> SEQ Figure \* ARABIC </w:instrText>
-      </w:r>
-      <w:r>
-        <w:fldChar w:fldCharType="separate"/>
-      </w:r>
-      <w:r>
-        <w:rPr>
-          <w:noProof/>
-        </w:rPr>
-        <w:t>15</w:t>
-      </w:r>
-      <w:r>
-        <w:fldChar w:fldCharType="end"/>
-      </w:r>
+      <w:fldSimple w:instr=" SEQ Figure \* ARABIC ">
+        <w:r>
+          <w:rPr>
+            <w:noProof/>
+          </w:rPr>
+          <w:t>15</w:t>
+        </w:r>
+      </w:fldSimple>
     </w:p>
     <w:p>
       <w:pPr>
@@ -7631,6 +7668,20 @@
         </w:rPr>
         <w:t>:</w:t>
       </w:r>
+      <w:r>
+        <w:rPr>
+          <w:sz w:val="20"/>
+          <w:szCs w:val="20"/>
+        </w:rPr>
+        <w:t xml:space="preserve"> </w:t>
+      </w:r>
+      <w:r>
+        <w:rPr>
+          <w:sz w:val="20"/>
+          <w:szCs w:val="20"/>
+        </w:rPr>
+        <w:t>USB 2.0 Hub Controller</w:t>
+      </w:r>
     </w:p>
     <w:p>
       <w:pPr>
@@ -7653,6 +7704,20 @@
           <w:szCs w:val="20"/>
         </w:rPr>
         <w:t>:</w:t>
+      </w:r>
+      <w:r>
+        <w:rPr>
+          <w:sz w:val="20"/>
+          <w:szCs w:val="20"/>
+        </w:rPr>
+        <w:t xml:space="preserve"> </w:t>
+      </w:r>
+      <w:r>
+        <w:rPr>
+          <w:sz w:val="20"/>
+          <w:szCs w:val="20"/>
+        </w:rPr>
+        <w:t>USB-A (USB TYPE-A) USB 2.0 Receptacle Connector 4 Position Surface Mount, Right Angle</w:t>
       </w:r>
     </w:p>
     <w:p>
@@ -7693,6 +7758,43 @@
           <w:sz w:val="20"/>
           <w:szCs w:val="20"/>
         </w:rPr>
+        <w:t>USB</w:t>
+      </w:r>
+      <w:r>
+        <w:rPr>
+          <w:sz w:val="20"/>
+          <w:szCs w:val="20"/>
+        </w:rPr>
+        <w:t xml:space="preserve"> </w:t>
+      </w:r>
+      <w:proofErr w:type="spellStart"/>
+      <w:r>
+        <w:rPr>
+          <w:sz w:val="20"/>
+          <w:szCs w:val="20"/>
+        </w:rPr>
+        <w:t>Tyoe</w:t>
+      </w:r>
+      <w:proofErr w:type="spellEnd"/>
+      <w:r>
+        <w:rPr>
+          <w:sz w:val="20"/>
+          <w:szCs w:val="20"/>
+        </w:rPr>
+        <w:t xml:space="preserve"> A</w:t>
+      </w:r>
+      <w:r>
+        <w:rPr>
+          <w:sz w:val="20"/>
+          <w:szCs w:val="20"/>
+        </w:rPr>
+        <w:t xml:space="preserve"> connectors 87583-2010BLF are present in the schematic and are only connected to USB host IC. The GL850G USB host IC is being used which embeds an 8-bit RISC processor to manipulate the control/status registers and respond to the requests from the USB host. Since the pins are bidirectional, 3 channels of host IC are connected to </w:t>
+      </w:r>
+      <w:r>
+        <w:rPr>
+          <w:sz w:val="20"/>
+          <w:szCs w:val="20"/>
+        </w:rPr>
         <w:t>micro-USB</w:t>
       </w:r>
       <w:r>
@@ -7700,22 +7802,52 @@
           <w:sz w:val="20"/>
           <w:szCs w:val="20"/>
         </w:rPr>
-        <w:t xml:space="preserve"> connectors 87583-2010BLF are present in the schematic and are only connected to USB host IC. The GL850G USB host IC is being used which embeds an 8-bit RISC processor to manipulate the control/status registers and respond to the requests from the USB host. Since the pins are bidirectional, 3 channels of host IC are connected to </w:t>
-      </w:r>
-      <w:r>
-        <w:rPr>
-          <w:sz w:val="20"/>
-          <w:szCs w:val="20"/>
-        </w:rPr>
-        <w:t>micro-USB</w:t>
-      </w:r>
-      <w:r>
-        <w:rPr>
-          <w:sz w:val="20"/>
-          <w:szCs w:val="20"/>
-        </w:rPr>
-        <w:t xml:space="preserve"> connectors and the remaining two channels, DX0 and DX1, are connected to MCU and 3G modem respectively.  </w:t>
-      </w:r>
+        <w:t xml:space="preserve"> connectors and the remaining two channels, DX0 and DX1, are connected to MCU and 3G modem respectively.</w:t>
+      </w:r>
+    </w:p>
+    <w:p>
+      <w:pPr>
+        <w:ind w:left="360"/>
+        <w:rPr>
+          <w:b/>
+          <w:bCs/>
+          <w:u w:val="single"/>
+        </w:rPr>
+      </w:pPr>
+      <w:r>
+        <w:rPr>
+          <w:b/>
+          <w:bCs/>
+          <w:u w:val="single"/>
+        </w:rPr>
+        <w:t>Link:</w:t>
+      </w:r>
+    </w:p>
+    <w:p>
+      <w:pPr>
+        <w:ind w:left="360"/>
+        <w:rPr>
+          <w:u w:val="single"/>
+        </w:rPr>
+      </w:pPr>
+      <w:hyperlink r:id="rId39" w:history="1">
+        <w:r>
+          <w:rPr>
+            <w:rStyle w:val="Hyperlink"/>
+          </w:rPr>
+          <w:t>https://datasheet.lcsc.com/szlcsc/Genesys-Logic-GL850G-HHY22_C136617.pdf</w:t>
+        </w:r>
+      </w:hyperlink>
+    </w:p>
+    <w:p>
+      <w:pPr>
+        <w:ind w:left="360"/>
+        <w:rPr>
+          <w:b/>
+          <w:bCs/>
+          <w:u w:val="single"/>
+        </w:rPr>
+      </w:pPr>
     </w:p>
     <w:p/>
     <w:p>
@@ -7742,7 +7874,7 @@
                     <pic:cNvPicPr preferRelativeResize="0"/>
                   </pic:nvPicPr>
                   <pic:blipFill>
-                    <a:blip r:embed="rId39"/>
+                    <a:blip r:embed="rId40"/>
                     <a:srcRect/>
                     <a:stretch>
                       <a:fillRect/>
@@ -7772,24 +7904,14 @@
       <w:r>
         <w:t xml:space="preserve">Figure </w:t>
       </w:r>
-      <w:r>
-        <w:fldChar w:fldCharType="begin"/>
-      </w:r>
-      <w:r>
-        <w:instrText xml:space="preserve"> SEQ Figure \* ARABIC </w:instrText>
-      </w:r>
-      <w:r>
-        <w:fldChar w:fldCharType="separate"/>
-      </w:r>
-      <w:r>
-        <w:rPr>
-          <w:noProof/>
-        </w:rPr>
-        <w:t>16</w:t>
-      </w:r>
-      <w:r>
-        <w:fldChar w:fldCharType="end"/>
-      </w:r>
+      <w:fldSimple w:instr=" SEQ Figure \* ARABIC ">
+        <w:r>
+          <w:rPr>
+            <w:noProof/>
+          </w:rPr>
+          <w:t>16</w:t>
+        </w:r>
+      </w:fldSimple>
     </w:p>
     <w:p/>
     <w:p>
@@ -7981,6 +8103,22 @@
         </w:rPr>
         <w:t>Link:</w:t>
       </w:r>
+    </w:p>
+    <w:p>
+      <w:pPr>
+        <w:ind w:left="360"/>
+        <w:rPr>
+          <w:u w:val="single"/>
+        </w:rPr>
+      </w:pPr>
+      <w:hyperlink r:id="rId41" w:history="1">
+        <w:r>
+          <w:rPr>
+            <w:rStyle w:val="Hyperlink"/>
+          </w:rPr>
+          <w:t>https://img.ozdisan.com/ETicaret_Dosya/470612_2154920.PDF</w:t>
+        </w:r>
+      </w:hyperlink>
     </w:p>
     <w:p>
       <w:pPr>
@@ -8015,7 +8153,7 @@
                     <pic:cNvPicPr preferRelativeResize="0"/>
                   </pic:nvPicPr>
                   <pic:blipFill>
-                    <a:blip r:embed="rId40"/>
+                    <a:blip r:embed="rId42"/>
                     <a:srcRect/>
                     <a:stretch>
                       <a:fillRect/>
@@ -8051,24 +8189,14 @@
       <w:r>
         <w:t xml:space="preserve">Figure </w:t>
       </w:r>
-      <w:r>
-        <w:fldChar w:fldCharType="begin"/>
-      </w:r>
-      <w:r>
-        <w:instrText xml:space="preserve"> SEQ Figure \* ARABIC </w:instrText>
-      </w:r>
-      <w:r>
-        <w:fldChar w:fldCharType="separate"/>
-      </w:r>
-      <w:r>
-        <w:rPr>
-          <w:noProof/>
-        </w:rPr>
-        <w:t>17</w:t>
-      </w:r>
-      <w:r>
-        <w:fldChar w:fldCharType="end"/>
-      </w:r>
+      <w:fldSimple w:instr=" SEQ Figure \* ARABIC ">
+        <w:r>
+          <w:rPr>
+            <w:noProof/>
+          </w:rPr>
+          <w:t>17</w:t>
+        </w:r>
+      </w:fldSimple>
     </w:p>
     <w:p>
       <w:pPr>
@@ -8145,6 +8273,7 @@
           <w:sz w:val="20"/>
           <w:szCs w:val="20"/>
         </w:rPr>
+        <w:lastRenderedPageBreak/>
         <w:t>Sensor Section</w:t>
       </w:r>
     </w:p>
@@ -8166,7 +8295,6 @@
         <w:rPr>
           <w:color w:val="0000FF"/>
         </w:rPr>
-        <w:lastRenderedPageBreak/>
         <w:t>Keys Button Section:</w:t>
       </w:r>
       <w:bookmarkEnd w:id="49"/>
@@ -8210,23 +8338,7 @@
           <w:sz w:val="20"/>
           <w:szCs w:val="20"/>
         </w:rPr>
-        <w:t>TL3301NF160QG/TR</w:t>
-      </w:r>
-      <w:r>
-        <w:rPr>
-          <w:bCs/>
-          <w:sz w:val="20"/>
-          <w:szCs w:val="20"/>
-        </w:rPr>
-        <w:t xml:space="preserve">: </w:t>
-      </w:r>
-      <w:r>
-        <w:rPr>
-          <w:bCs/>
-          <w:sz w:val="20"/>
-          <w:szCs w:val="20"/>
-        </w:rPr>
-        <w:t>Tactile Switch SPST-NO Top Actuated Surface Mount</w:t>
+        <w:t>TL3301NF160QG/TR: Tactile Switch SPST-NO Top Actuated Surface Mount</w:t>
       </w:r>
     </w:p>
     <w:p>
@@ -8302,7 +8414,7 @@
                     <pic:cNvPicPr preferRelativeResize="0"/>
                   </pic:nvPicPr>
                   <pic:blipFill>
-                    <a:blip r:embed="rId41"/>
+                    <a:blip r:embed="rId43"/>
                     <a:srcRect/>
                     <a:stretch>
                       <a:fillRect/>
@@ -8338,24 +8450,14 @@
       <w:r>
         <w:t xml:space="preserve">Figure </w:t>
       </w:r>
-      <w:r>
-        <w:fldChar w:fldCharType="begin"/>
-      </w:r>
-      <w:r>
-        <w:instrText xml:space="preserve"> SEQ Figure \* ARABIC </w:instrText>
-      </w:r>
-      <w:r>
-        <w:fldChar w:fldCharType="separate"/>
-      </w:r>
-      <w:r>
-        <w:rPr>
-          <w:noProof/>
-        </w:rPr>
-        <w:t>18</w:t>
-      </w:r>
-      <w:r>
-        <w:fldChar w:fldCharType="end"/>
-      </w:r>
+      <w:fldSimple w:instr=" SEQ Figure \* ARABIC ">
+        <w:r>
+          <w:rPr>
+            <w:noProof/>
+          </w:rPr>
+          <w:t>18</w:t>
+        </w:r>
+      </w:fldSimple>
     </w:p>
     <w:p>
       <w:pPr>
@@ -8380,7 +8482,7 @@
                     <pic:cNvPicPr preferRelativeResize="0"/>
                   </pic:nvPicPr>
                   <pic:blipFill>
-                    <a:blip r:embed="rId42"/>
+                    <a:blip r:embed="rId44"/>
                     <a:srcRect/>
                     <a:stretch>
                       <a:fillRect/>
@@ -8416,24 +8518,14 @@
       <w:r>
         <w:t xml:space="preserve">Figure </w:t>
       </w:r>
-      <w:r>
-        <w:fldChar w:fldCharType="begin"/>
-      </w:r>
-      <w:r>
-        <w:instrText xml:space="preserve"> SEQ Figure \* ARABIC </w:instrText>
-      </w:r>
-      <w:r>
-        <w:fldChar w:fldCharType="separate"/>
-      </w:r>
-      <w:r>
-        <w:rPr>
-          <w:noProof/>
-        </w:rPr>
-        <w:t>19</w:t>
-      </w:r>
-      <w:r>
-        <w:fldChar w:fldCharType="end"/>
-      </w:r>
+      <w:fldSimple w:instr=" SEQ Figure \* ARABIC ">
+        <w:r>
+          <w:rPr>
+            <w:noProof/>
+          </w:rPr>
+          <w:t>19</w:t>
+        </w:r>
+      </w:fldSimple>
     </w:p>
     <w:p>
       <w:r>
@@ -8500,41 +8592,26 @@
           <w:sz w:val="20"/>
           <w:szCs w:val="20"/>
         </w:rPr>
-        <w:t>ICM-42688-P</w:t>
-      </w:r>
-      <w:r>
+        <w:t>ICM-42688-P: 6 axis IMU senor</w:t>
+      </w:r>
+    </w:p>
+    <w:p>
+      <w:pPr>
+        <w:ind w:left="360"/>
         <w:rPr>
           <w:bCs/>
           <w:sz w:val="20"/>
           <w:szCs w:val="20"/>
         </w:rPr>
-        <w:t>: 6 axis IMU senor</w:t>
-      </w:r>
-    </w:p>
-    <w:p>
-      <w:pPr>
-        <w:ind w:left="360"/>
+      </w:pPr>
+      <w:r>
         <w:rPr>
           <w:bCs/>
           <w:sz w:val="20"/>
           <w:szCs w:val="20"/>
         </w:rPr>
-      </w:pPr>
-      <w:r>
-        <w:rPr>
-          <w:bCs/>
-          <w:sz w:val="20"/>
-          <w:szCs w:val="20"/>
-        </w:rPr>
-        <w:t>VEML6030-GS15</w:t>
-      </w:r>
-      <w:r>
-        <w:rPr>
-          <w:bCs/>
-          <w:sz w:val="20"/>
-          <w:szCs w:val="20"/>
-        </w:rPr>
-        <w:t>: light sensor</w:t>
+        <w:lastRenderedPageBreak/>
+        <w:t>VEML6030-GS15: light sensor</w:t>
       </w:r>
       <w:r>
         <w:rPr>
@@ -8576,7 +8653,6 @@
           <w:sz w:val="20"/>
           <w:szCs w:val="20"/>
         </w:rPr>
-        <w:lastRenderedPageBreak/>
         <w:t xml:space="preserve">The tablet currently has a 6 axis IMU sensor </w:t>
       </w:r>
       <w:r>
@@ -8607,7 +8683,23 @@
           <w:sz w:val="20"/>
           <w:szCs w:val="20"/>
         </w:rPr>
-        <w:t>. Both sensors are connected through the I2C 2 interface of the SoM with different address lines.</w:t>
+        <w:t xml:space="preserve">. Both sensors are connected through the I2C 2 interface of the </w:t>
+      </w:r>
+      <w:proofErr w:type="spellStart"/>
+      <w:r>
+        <w:rPr>
+          <w:sz w:val="20"/>
+          <w:szCs w:val="20"/>
+        </w:rPr>
+        <w:t>SoM</w:t>
+      </w:r>
+      <w:proofErr w:type="spellEnd"/>
+      <w:r>
+        <w:rPr>
+          <w:sz w:val="20"/>
+          <w:szCs w:val="20"/>
+        </w:rPr>
+        <w:t xml:space="preserve"> with different address lines.</w:t>
       </w:r>
     </w:p>
     <w:p>
@@ -8633,7 +8725,7 @@
                     <pic:cNvPicPr preferRelativeResize="0"/>
                   </pic:nvPicPr>
                   <pic:blipFill>
-                    <a:blip r:embed="rId43"/>
+                    <a:blip r:embed="rId45"/>
                     <a:srcRect/>
                     <a:stretch>
                       <a:fillRect/>
@@ -8669,24 +8761,14 @@
       <w:r>
         <w:t xml:space="preserve">Figure </w:t>
       </w:r>
-      <w:r>
-        <w:fldChar w:fldCharType="begin"/>
-      </w:r>
-      <w:r>
-        <w:instrText xml:space="preserve"> SEQ Figure \* ARABIC </w:instrText>
-      </w:r>
-      <w:r>
-        <w:fldChar w:fldCharType="separate"/>
-      </w:r>
-      <w:r>
-        <w:rPr>
-          <w:noProof/>
-        </w:rPr>
-        <w:t>20</w:t>
-      </w:r>
-      <w:r>
-        <w:fldChar w:fldCharType="end"/>
-      </w:r>
+      <w:fldSimple w:instr=" SEQ Figure \* ARABIC ">
+        <w:r>
+          <w:rPr>
+            <w:noProof/>
+          </w:rPr>
+          <w:t>20</w:t>
+        </w:r>
+      </w:fldSimple>
     </w:p>
     <w:p>
       <w:pPr>
@@ -8734,7 +8816,7 @@
                     <pic:cNvPicPr preferRelativeResize="0"/>
                   </pic:nvPicPr>
                   <pic:blipFill>
-                    <a:blip r:embed="rId44"/>
+                    <a:blip r:embed="rId46"/>
                     <a:srcRect/>
                     <a:stretch>
                       <a:fillRect/>
@@ -8770,24 +8852,61 @@
       <w:r>
         <w:t xml:space="preserve">Figure </w:t>
       </w:r>
-      <w:r>
-        <w:fldChar w:fldCharType="begin"/>
-      </w:r>
-      <w:r>
-        <w:instrText xml:space="preserve"> SEQ Figure \* ARABIC </w:instrText>
-      </w:r>
-      <w:r>
-        <w:fldChar w:fldCharType="separate"/>
-      </w:r>
-      <w:r>
-        <w:rPr>
-          <w:noProof/>
-        </w:rPr>
-        <w:t>21</w:t>
-      </w:r>
-      <w:r>
-        <w:fldChar w:fldCharType="end"/>
-      </w:r>
+      <w:fldSimple w:instr=" SEQ Figure \* ARABIC ">
+        <w:r>
+          <w:rPr>
+            <w:noProof/>
+          </w:rPr>
+          <w:t>21</w:t>
+        </w:r>
+      </w:fldSimple>
+    </w:p>
+    <w:p>
+      <w:pPr>
+        <w:rPr>
+          <w:b/>
+          <w:bCs/>
+          <w:u w:val="single"/>
+        </w:rPr>
+      </w:pPr>
+      <w:r>
+        <w:rPr>
+          <w:b/>
+          <w:bCs/>
+          <w:u w:val="single"/>
+        </w:rPr>
+        <w:t>Link:</w:t>
+      </w:r>
+    </w:p>
+    <w:p>
+      <w:pPr>
+        <w:rPr>
+          <w:u w:val="single"/>
+        </w:rPr>
+      </w:pPr>
+      <w:hyperlink r:id="rId47" w:history="1">
+        <w:r>
+          <w:rPr>
+            <w:rStyle w:val="Hyperlink"/>
+          </w:rPr>
+          <w:t>https://www.vishay.com/docs/84366/veml6030.pdf</w:t>
+        </w:r>
+      </w:hyperlink>
+    </w:p>
+    <w:p>
+      <w:pPr>
+        <w:rPr>
+          <w:u w:val="single"/>
+        </w:rPr>
+      </w:pPr>
+      <w:hyperlink r:id="rId48" w:history="1">
+        <w:r>
+          <w:rPr>
+            <w:rStyle w:val="Hyperlink"/>
+          </w:rPr>
+          <w:t>https://product.tdk.com/system/files/dam/doc/product/sensor/mortion-inertial/imu/data_sheet/ds-000347-icm-42688-p-v1.2.pdf</w:t>
+        </w:r>
+      </w:hyperlink>
     </w:p>
     <w:p>
       <w:pPr>
@@ -8848,15 +8967,7 @@
           <w:sz w:val="20"/>
           <w:szCs w:val="20"/>
         </w:rPr>
-        <w:t>DC-005-5A-2.5-SMT</w:t>
-      </w:r>
-      <w:r>
-        <w:rPr>
-          <w:bCs/>
-          <w:sz w:val="20"/>
-          <w:szCs w:val="20"/>
-        </w:rPr>
-        <w:t>:</w:t>
+        <w:t>DC-005-5A-2.5-SMT:</w:t>
       </w:r>
       <w:r>
         <w:rPr>
@@ -8880,15 +8991,7 @@
           <w:sz w:val="20"/>
           <w:szCs w:val="20"/>
         </w:rPr>
-        <w:t>0527460471</w:t>
-      </w:r>
-      <w:r>
-        <w:rPr>
-          <w:bCs/>
-          <w:sz w:val="20"/>
-          <w:szCs w:val="20"/>
-        </w:rPr>
-        <w:t>:</w:t>
+        <w:t>0527460471:</w:t>
       </w:r>
       <w:r>
         <w:rPr>
@@ -8958,7 +9061,23 @@
           <w:sz w:val="20"/>
           <w:szCs w:val="20"/>
         </w:rPr>
-        <w:t xml:space="preserve"> and SMD pads for battery input.  The input is connected to necessary bulk capacitance for a stable supply. Battery is expected to be 3.7V Lipo whereas the adaptor will provide 5V power input. The input signals from this section connect to the main controller section which has a built-in power management circuitry with battery charging facility. </w:t>
+        <w:t xml:space="preserve"> and SMD pads for battery input.  The input is connected to necessary bulk capacitance for a stable supply. Battery is expected to be 3.7V </w:t>
+      </w:r>
+      <w:proofErr w:type="spellStart"/>
+      <w:r>
+        <w:rPr>
+          <w:sz w:val="20"/>
+          <w:szCs w:val="20"/>
+        </w:rPr>
+        <w:t>Lipo</w:t>
+      </w:r>
+      <w:proofErr w:type="spellEnd"/>
+      <w:r>
+        <w:rPr>
+          <w:sz w:val="20"/>
+          <w:szCs w:val="20"/>
+        </w:rPr>
+        <w:t xml:space="preserve"> whereas the adaptor will provide 5V power input. The input signals from this section connect to the main controller section which has a built-in power management circuitry with battery charging facility. </w:t>
       </w:r>
     </w:p>
     <w:p>
@@ -8985,7 +9104,7 @@
                     <pic:cNvPicPr preferRelativeResize="0"/>
                   </pic:nvPicPr>
                   <pic:blipFill>
-                    <a:blip r:embed="rId45"/>
+                    <a:blip r:embed="rId49"/>
                     <a:srcRect/>
                     <a:stretch>
                       <a:fillRect/>
@@ -9021,24 +9140,14 @@
       <w:r>
         <w:t xml:space="preserve">Figure </w:t>
       </w:r>
-      <w:r>
-        <w:fldChar w:fldCharType="begin"/>
-      </w:r>
-      <w:r>
-        <w:instrText xml:space="preserve"> SEQ Figure \* ARABIC </w:instrText>
-      </w:r>
-      <w:r>
-        <w:fldChar w:fldCharType="separate"/>
-      </w:r>
-      <w:r>
-        <w:rPr>
-          <w:noProof/>
-        </w:rPr>
-        <w:t>22</w:t>
-      </w:r>
-      <w:r>
-        <w:fldChar w:fldCharType="end"/>
-      </w:r>
+      <w:fldSimple w:instr=" SEQ Figure \* ARABIC ">
+        <w:r>
+          <w:rPr>
+            <w:noProof/>
+          </w:rPr>
+          <w:t>22</w:t>
+        </w:r>
+      </w:fldSimple>
     </w:p>
     <w:p>
       <w:pPr>
@@ -9063,7 +9172,7 @@
                     <pic:cNvPicPr preferRelativeResize="0"/>
                   </pic:nvPicPr>
                   <pic:blipFill>
-                    <a:blip r:embed="rId46"/>
+                    <a:blip r:embed="rId50"/>
                     <a:srcRect/>
                     <a:stretch>
                       <a:fillRect/>
@@ -9099,24 +9208,14 @@
       <w:r>
         <w:t xml:space="preserve">Figure </w:t>
       </w:r>
-      <w:r>
-        <w:fldChar w:fldCharType="begin"/>
-      </w:r>
-      <w:r>
-        <w:instrText xml:space="preserve"> SEQ Figure \* ARABIC </w:instrText>
-      </w:r>
-      <w:r>
-        <w:fldChar w:fldCharType="separate"/>
-      </w:r>
-      <w:r>
-        <w:rPr>
-          <w:noProof/>
-        </w:rPr>
-        <w:t>23</w:t>
-      </w:r>
-      <w:r>
-        <w:fldChar w:fldCharType="end"/>
-      </w:r>
+      <w:fldSimple w:instr=" SEQ Figure \* ARABIC ">
+        <w:r>
+          <w:rPr>
+            <w:noProof/>
+          </w:rPr>
+          <w:t>23</w:t>
+        </w:r>
+      </w:fldSimple>
     </w:p>
     <w:p>
       <w:bookmarkStart w:id="54" w:name="_h0s53u5ky1y8" w:colFirst="0" w:colLast="0"/>
@@ -9143,25 +9242,58 @@
       <w:bookmarkEnd w:id="55"/>
     </w:p>
     <w:p>
-      <w:r>
+      <w:pPr>
+        <w:rPr>
+          <w:sz w:val="20"/>
+          <w:szCs w:val="20"/>
+        </w:rPr>
+      </w:pPr>
+      <w:r>
+        <w:rPr>
+          <w:sz w:val="20"/>
+          <w:szCs w:val="20"/>
+        </w:rPr>
         <w:t>Following components/circuits needs to be added to the current design as per the instructions given in block diagram provided by client.</w:t>
       </w:r>
     </w:p>
-    <w:p/>
+    <w:p>
+      <w:pPr>
+        <w:rPr>
+          <w:sz w:val="20"/>
+          <w:szCs w:val="20"/>
+        </w:rPr>
+      </w:pPr>
+    </w:p>
     <w:p>
       <w:pPr>
         <w:numPr>
           <w:ilvl w:val="0"/>
           <w:numId w:val="8"/>
         </w:numPr>
-      </w:pPr>
-      <w:r>
+        <w:rPr>
+          <w:sz w:val="20"/>
+          <w:szCs w:val="20"/>
+        </w:rPr>
+      </w:pPr>
+      <w:r>
+        <w:rPr>
+          <w:sz w:val="20"/>
+          <w:szCs w:val="20"/>
+        </w:rPr>
         <w:t xml:space="preserve">Another </w:t>
       </w:r>
       <w:r>
+        <w:rPr>
+          <w:sz w:val="20"/>
+          <w:szCs w:val="20"/>
+        </w:rPr>
         <w:t>camera interface</w:t>
       </w:r>
       <w:r>
+        <w:rPr>
+          <w:sz w:val="20"/>
+          <w:szCs w:val="20"/>
+        </w:rPr>
         <w:t xml:space="preserve"> needs to be added for front view.</w:t>
       </w:r>
     </w:p>
@@ -9171,8 +9303,16 @@
           <w:ilvl w:val="0"/>
           <w:numId w:val="8"/>
         </w:numPr>
-      </w:pPr>
-      <w:r>
+        <w:rPr>
+          <w:sz w:val="20"/>
+          <w:szCs w:val="20"/>
+        </w:rPr>
+      </w:pPr>
+      <w:r>
+        <w:rPr>
+          <w:sz w:val="20"/>
+          <w:szCs w:val="20"/>
+        </w:rPr>
         <w:t>Backlight LED driver depending on the choice of LCD.</w:t>
       </w:r>
     </w:p>
@@ -9182,8 +9322,16 @@
           <w:ilvl w:val="0"/>
           <w:numId w:val="8"/>
         </w:numPr>
-      </w:pPr>
-      <w:r>
+        <w:rPr>
+          <w:sz w:val="20"/>
+          <w:szCs w:val="20"/>
+        </w:rPr>
+      </w:pPr>
+      <w:r>
+        <w:rPr>
+          <w:sz w:val="20"/>
+          <w:szCs w:val="20"/>
+        </w:rPr>
         <w:t>Debug FPC connector needs to be added.</w:t>
       </w:r>
     </w:p>
@@ -9193,8 +9341,16 @@
           <w:ilvl w:val="0"/>
           <w:numId w:val="8"/>
         </w:numPr>
-      </w:pPr>
-      <w:r>
+        <w:rPr>
+          <w:sz w:val="20"/>
+          <w:szCs w:val="20"/>
+        </w:rPr>
+      </w:pPr>
+      <w:r>
+        <w:rPr>
+          <w:sz w:val="20"/>
+          <w:szCs w:val="20"/>
+        </w:rPr>
         <w:t>There should be a speaker connected to the audio codec.</w:t>
       </w:r>
     </w:p>
@@ -9204,9 +9360,33 @@
           <w:ilvl w:val="0"/>
           <w:numId w:val="8"/>
         </w:numPr>
-      </w:pPr>
-      <w:r>
-        <w:t>There is no Bluetooth or WiFi feature available in the design.</w:t>
+        <w:rPr>
+          <w:sz w:val="20"/>
+          <w:szCs w:val="20"/>
+        </w:rPr>
+      </w:pPr>
+      <w:r>
+        <w:rPr>
+          <w:sz w:val="20"/>
+          <w:szCs w:val="20"/>
+        </w:rPr>
+        <w:t xml:space="preserve">There is no Bluetooth or </w:t>
+      </w:r>
+      <w:proofErr w:type="spellStart"/>
+      <w:r>
+        <w:rPr>
+          <w:sz w:val="20"/>
+          <w:szCs w:val="20"/>
+        </w:rPr>
+        <w:t>WiFi</w:t>
+      </w:r>
+      <w:proofErr w:type="spellEnd"/>
+      <w:r>
+        <w:rPr>
+          <w:sz w:val="20"/>
+          <w:szCs w:val="20"/>
+        </w:rPr>
+        <w:t xml:space="preserve"> feature available in the design.</w:t>
       </w:r>
     </w:p>
     <w:p>
@@ -9215,11 +9395,28 @@
           <w:ilvl w:val="0"/>
           <w:numId w:val="8"/>
         </w:numPr>
-      </w:pPr>
-      <w:r>
+        <w:rPr>
+          <w:sz w:val="20"/>
+          <w:szCs w:val="20"/>
+        </w:rPr>
+      </w:pPr>
+      <w:r>
+        <w:rPr>
+          <w:sz w:val="20"/>
+          <w:szCs w:val="20"/>
+        </w:rPr>
         <w:lastRenderedPageBreak/>
-        <w:t>Not enough GPIOs are available for connecting SIM7100. The RESET pin, PWRKEY (which enables the module) and flight mode pin (which controls RF function) are not connected to the SoM.</w:t>
-      </w:r>
+        <w:t xml:space="preserve">Not enough GPIOs are available for connecting SIM7100. The RESET pin, PWRKEY (which enables the module) and flight mode pin (which controls RF function) are not connected to the </w:t>
+      </w:r>
+      <w:proofErr w:type="spellStart"/>
+      <w:r>
+        <w:rPr>
+          <w:sz w:val="20"/>
+          <w:szCs w:val="20"/>
+        </w:rPr>
+        <w:t>SoM.</w:t>
+      </w:r>
+      <w:proofErr w:type="spellEnd"/>
     </w:p>
     <w:p>
       <w:pPr>
@@ -9227,8 +9424,16 @@
           <w:ilvl w:val="0"/>
           <w:numId w:val="8"/>
         </w:numPr>
-      </w:pPr>
-      <w:r>
+        <w:rPr>
+          <w:sz w:val="20"/>
+          <w:szCs w:val="20"/>
+        </w:rPr>
+      </w:pPr>
+      <w:r>
+        <w:rPr>
+          <w:sz w:val="20"/>
+          <w:szCs w:val="20"/>
+        </w:rPr>
         <w:t>Extra SD card connector needs to be removed from the design. The tablet can work well with a single SD card.</w:t>
       </w:r>
     </w:p>
@@ -9247,11 +9452,39 @@
           <w:bCs/>
           <w:color w:val="000000" w:themeColor="text1"/>
         </w:rPr>
-        <w:t>Alternate Suggestions for SoM G4418:</w:t>
-      </w:r>
-    </w:p>
-    <w:p>
-      <w:r>
+        <w:t xml:space="preserve">Alternate Suggestions for </w:t>
+      </w:r>
+      <w:proofErr w:type="spellStart"/>
+      <w:r>
+        <w:rPr>
+          <w:b/>
+          <w:bCs/>
+          <w:color w:val="000000" w:themeColor="text1"/>
+        </w:rPr>
+        <w:t>SoM</w:t>
+      </w:r>
+      <w:proofErr w:type="spellEnd"/>
+      <w:r>
+        <w:rPr>
+          <w:b/>
+          <w:bCs/>
+          <w:color w:val="000000" w:themeColor="text1"/>
+        </w:rPr>
+        <w:t xml:space="preserve"> G4418:</w:t>
+      </w:r>
+    </w:p>
+    <w:p>
+      <w:pPr>
+        <w:rPr>
+          <w:sz w:val="20"/>
+          <w:szCs w:val="20"/>
+        </w:rPr>
+      </w:pPr>
+      <w:r>
+        <w:rPr>
+          <w:sz w:val="20"/>
+          <w:szCs w:val="20"/>
+        </w:rPr>
         <w:t>Here are some other efficient alternates to the current processing unit being used in the design.</w:t>
       </w:r>
     </w:p>
@@ -9297,7 +9530,14 @@
       </w:r>
     </w:p>
     <w:p>
-      <w:r>
+      <w:pPr>
+        <w:ind w:left="450"/>
+      </w:pPr>
+      <w:r>
+        <w:rPr>
+          <w:sz w:val="20"/>
+          <w:szCs w:val="20"/>
+        </w:rPr>
         <w:t>The VAR-SOM-MX6 is a high-performance System-on-Module. It provides an ideal building block that easily integrates with a wide range of target markets requiring rich multimedia functionality, powerful graphics and video capabilities, as well as high-processing power. Compact, cost effective and with low power consumption, VAR-SOM-MX6 secures an Intel Atom performance level.</w:t>
       </w:r>
       <w:r>
@@ -9305,10 +9545,21 @@
       </w:r>
     </w:p>
     <w:p>
-      <w:r>
-        <w:t xml:space="preserve">Datasheet Link: </w:t>
-      </w:r>
-      <w:hyperlink r:id="rId47" w:history="1">
+      <w:pPr>
+        <w:ind w:left="360"/>
+      </w:pPr>
+      <w:r>
+        <w:rPr>
+          <w:b/>
+          <w:bCs/>
+          <w:u w:val="single"/>
+        </w:rPr>
+        <w:t>Datasheet Link:</w:t>
+      </w:r>
+      <w:r>
+        <w:t xml:space="preserve"> </w:t>
+      </w:r>
+      <w:hyperlink r:id="rId51" w:history="1">
         <w:r>
           <w:rPr>
             <w:rStyle w:val="Hyperlink"/>
@@ -9325,8 +9576,9 @@
       <w:r>
         <w:rPr>
           <w:rStyle w:val="Hyperlink"/>
+          <w:b/>
+          <w:bCs/>
           <w:color w:val="auto"/>
-          <w:u w:val="none"/>
         </w:rPr>
         <w:t>Reference Design:</w:t>
       </w:r>
@@ -9338,7 +9590,7 @@
         </w:rPr>
         <w:t xml:space="preserve"> </w:t>
       </w:r>
-      <w:hyperlink r:id="rId48" w:history="1">
+      <w:hyperlink r:id="rId52" w:history="1">
         <w:r>
           <w:rPr>
             <w:rStyle w:val="Hyperlink"/>
@@ -9372,14 +9624,30 @@
           <w:ilvl w:val="0"/>
           <w:numId w:val="17"/>
         </w:numPr>
-      </w:pPr>
-      <w:r>
+        <w:rPr>
+          <w:sz w:val="20"/>
+          <w:szCs w:val="20"/>
+        </w:rPr>
+      </w:pPr>
+      <w:r>
+        <w:rPr>
+          <w:sz w:val="20"/>
+          <w:szCs w:val="20"/>
+        </w:rPr>
         <w:t>Freescale i.MX6 series SoC (Single/Dual/Quad/</w:t>
       </w:r>
       <w:r>
+        <w:rPr>
+          <w:sz w:val="20"/>
+          <w:szCs w:val="20"/>
+        </w:rPr>
         <w:t>Quad Plus</w:t>
       </w:r>
       <w:r>
+        <w:rPr>
+          <w:sz w:val="20"/>
+          <w:szCs w:val="20"/>
+        </w:rPr>
         <w:t xml:space="preserve"> ARM® Cortex™-A9 Core, 1.2 GHz)</w:t>
       </w:r>
     </w:p>
@@ -9390,8 +9658,16 @@
           <w:ilvl w:val="0"/>
           <w:numId w:val="17"/>
         </w:numPr>
-      </w:pPr>
-      <w:r>
+        <w:rPr>
+          <w:sz w:val="20"/>
+          <w:szCs w:val="20"/>
+        </w:rPr>
+      </w:pPr>
+      <w:r>
+        <w:rPr>
+          <w:sz w:val="20"/>
+          <w:szCs w:val="20"/>
+        </w:rPr>
         <w:t>Up to 4GB DDR3 RAM</w:t>
       </w:r>
     </w:p>
@@ -9402,14 +9678,30 @@
           <w:ilvl w:val="0"/>
           <w:numId w:val="17"/>
         </w:numPr>
-      </w:pPr>
-      <w:r>
+        <w:rPr>
+          <w:sz w:val="20"/>
+          <w:szCs w:val="20"/>
+        </w:rPr>
+      </w:pPr>
+      <w:r>
+        <w:rPr>
+          <w:sz w:val="20"/>
+          <w:szCs w:val="20"/>
+        </w:rPr>
         <w:t xml:space="preserve">Up to 1GB NAND Flash </w:t>
       </w:r>
       <w:r>
+        <w:rPr>
+          <w:sz w:val="20"/>
+          <w:szCs w:val="20"/>
+        </w:rPr>
         <w:t>for storage</w:t>
       </w:r>
       <w:r>
+        <w:rPr>
+          <w:sz w:val="20"/>
+          <w:szCs w:val="20"/>
+        </w:rPr>
         <w:t xml:space="preserve"> memory / boot</w:t>
       </w:r>
     </w:p>
@@ -9420,8 +9712,16 @@
           <w:ilvl w:val="0"/>
           <w:numId w:val="17"/>
         </w:numPr>
-      </w:pPr>
-      <w:r>
+        <w:rPr>
+          <w:sz w:val="20"/>
+          <w:szCs w:val="20"/>
+        </w:rPr>
+      </w:pPr>
+      <w:r>
+        <w:rPr>
+          <w:sz w:val="20"/>
+          <w:szCs w:val="20"/>
+        </w:rPr>
         <w:t>Up to 64GB eMMC storage</w:t>
       </w:r>
     </w:p>
@@ -9432,8 +9732,16 @@
           <w:ilvl w:val="0"/>
           <w:numId w:val="17"/>
         </w:numPr>
-      </w:pPr>
-      <w:r>
+        <w:rPr>
+          <w:sz w:val="20"/>
+          <w:szCs w:val="20"/>
+        </w:rPr>
+      </w:pPr>
+      <w:r>
+        <w:rPr>
+          <w:sz w:val="20"/>
+          <w:szCs w:val="20"/>
+        </w:rPr>
         <w:t>2 x LVDS display interface</w:t>
       </w:r>
     </w:p>
@@ -9444,8 +9752,16 @@
           <w:ilvl w:val="0"/>
           <w:numId w:val="17"/>
         </w:numPr>
-      </w:pPr>
-      <w:r>
+        <w:rPr>
+          <w:sz w:val="20"/>
+          <w:szCs w:val="20"/>
+        </w:rPr>
+      </w:pPr>
+      <w:r>
+        <w:rPr>
+          <w:sz w:val="20"/>
+          <w:szCs w:val="20"/>
+        </w:rPr>
         <w:t>HDMI V1.4 interface</w:t>
       </w:r>
     </w:p>
@@ -9456,11 +9772,23 @@
           <w:ilvl w:val="0"/>
           <w:numId w:val="17"/>
         </w:numPr>
-      </w:pPr>
-      <w:r>
+        <w:rPr>
+          <w:sz w:val="20"/>
+          <w:szCs w:val="20"/>
+        </w:rPr>
+      </w:pPr>
+      <w:r>
+        <w:rPr>
+          <w:sz w:val="20"/>
+          <w:szCs w:val="20"/>
+        </w:rPr>
         <w:t>1 x MIPI DSI</w:t>
       </w:r>
       <w:r>
+        <w:rPr>
+          <w:sz w:val="20"/>
+          <w:szCs w:val="20"/>
+        </w:rPr>
         <w:t>.</w:t>
       </w:r>
     </w:p>
@@ -9471,11 +9799,23 @@
           <w:ilvl w:val="0"/>
           <w:numId w:val="17"/>
         </w:numPr>
-      </w:pPr>
-      <w:r>
+        <w:rPr>
+          <w:sz w:val="20"/>
+          <w:szCs w:val="20"/>
+        </w:rPr>
+      </w:pPr>
+      <w:r>
+        <w:rPr>
+          <w:sz w:val="20"/>
+          <w:szCs w:val="20"/>
+        </w:rPr>
         <w:t>Touch panel interface</w:t>
       </w:r>
       <w:r>
+        <w:rPr>
+          <w:sz w:val="20"/>
+          <w:szCs w:val="20"/>
+        </w:rPr>
         <w:t>.</w:t>
       </w:r>
     </w:p>
@@ -9486,8 +9826,16 @@
           <w:ilvl w:val="0"/>
           <w:numId w:val="17"/>
         </w:numPr>
-      </w:pPr>
-      <w:r>
+        <w:rPr>
+          <w:sz w:val="20"/>
+          <w:szCs w:val="20"/>
+        </w:rPr>
+      </w:pPr>
+      <w:r>
+        <w:rPr>
+          <w:sz w:val="20"/>
+          <w:szCs w:val="20"/>
+        </w:rPr>
         <w:t>Parallel &amp; serial camera interface</w:t>
       </w:r>
     </w:p>
@@ -9498,8 +9846,16 @@
           <w:ilvl w:val="0"/>
           <w:numId w:val="17"/>
         </w:numPr>
-      </w:pPr>
-      <w:r>
+        <w:rPr>
+          <w:sz w:val="20"/>
+          <w:szCs w:val="20"/>
+        </w:rPr>
+      </w:pPr>
+      <w:r>
+        <w:rPr>
+          <w:sz w:val="20"/>
+          <w:szCs w:val="20"/>
+        </w:rPr>
         <w:t>On-board 10/100/1000 Mbps Ethernet PHY</w:t>
       </w:r>
     </w:p>
@@ -9510,8 +9866,16 @@
           <w:ilvl w:val="0"/>
           <w:numId w:val="17"/>
         </w:numPr>
-      </w:pPr>
-      <w:r>
+        <w:rPr>
+          <w:sz w:val="20"/>
+          <w:szCs w:val="20"/>
+        </w:rPr>
+      </w:pPr>
+      <w:r>
+        <w:rPr>
+          <w:sz w:val="20"/>
+          <w:szCs w:val="20"/>
+        </w:rPr>
         <w:t>TI WiLink8 2.4/5GHz WLAN (802.11 a/b/g/n) / BT-BLE 4.1 with CSA2 support</w:t>
       </w:r>
     </w:p>
@@ -9522,8 +9886,16 @@
           <w:ilvl w:val="0"/>
           <w:numId w:val="17"/>
         </w:numPr>
-      </w:pPr>
-      <w:r>
+        <w:rPr>
+          <w:sz w:val="20"/>
+          <w:szCs w:val="20"/>
+        </w:rPr>
+      </w:pPr>
+      <w:r>
+        <w:rPr>
+          <w:sz w:val="20"/>
+          <w:szCs w:val="20"/>
+        </w:rPr>
         <w:t>and optional MIMO</w:t>
       </w:r>
     </w:p>
@@ -9534,8 +9906,16 @@
           <w:ilvl w:val="0"/>
           <w:numId w:val="17"/>
         </w:numPr>
-      </w:pPr>
-      <w:r>
+        <w:rPr>
+          <w:sz w:val="20"/>
+          <w:szCs w:val="20"/>
+        </w:rPr>
+      </w:pPr>
+      <w:r>
+        <w:rPr>
+          <w:sz w:val="20"/>
+          <w:szCs w:val="20"/>
+        </w:rPr>
         <w:t>1 x USB 2.0 host, 1 x OTG</w:t>
       </w:r>
     </w:p>
@@ -9546,11 +9926,23 @@
           <w:ilvl w:val="0"/>
           <w:numId w:val="17"/>
         </w:numPr>
-      </w:pPr>
-      <w:r>
+        <w:rPr>
+          <w:sz w:val="20"/>
+          <w:szCs w:val="20"/>
+        </w:rPr>
+      </w:pPr>
+      <w:r>
+        <w:rPr>
+          <w:sz w:val="20"/>
+          <w:szCs w:val="20"/>
+        </w:rPr>
         <w:t>1 x SD/MMC</w:t>
       </w:r>
       <w:r>
+        <w:rPr>
+          <w:sz w:val="20"/>
+          <w:szCs w:val="20"/>
+        </w:rPr>
         <w:t>.</w:t>
       </w:r>
     </w:p>
@@ -9561,14 +9953,30 @@
           <w:ilvl w:val="0"/>
           <w:numId w:val="17"/>
         </w:numPr>
-      </w:pPr>
-      <w:r>
+        <w:rPr>
+          <w:sz w:val="20"/>
+          <w:szCs w:val="20"/>
+        </w:rPr>
+      </w:pPr>
+      <w:r>
+        <w:rPr>
+          <w:sz w:val="20"/>
+          <w:szCs w:val="20"/>
+        </w:rPr>
         <w:t xml:space="preserve">Serial interfaces </w:t>
       </w:r>
       <w:r>
+        <w:rPr>
+          <w:sz w:val="20"/>
+          <w:szCs w:val="20"/>
+        </w:rPr>
         <w:t>(SPI,</w:t>
       </w:r>
       <w:r>
+        <w:rPr>
+          <w:sz w:val="20"/>
+          <w:szCs w:val="20"/>
+        </w:rPr>
         <w:t xml:space="preserve"> I2C, UART, I2S,)</w:t>
       </w:r>
     </w:p>
@@ -9579,11 +9987,23 @@
           <w:ilvl w:val="0"/>
           <w:numId w:val="17"/>
         </w:numPr>
-      </w:pPr>
-      <w:r>
+        <w:rPr>
+          <w:sz w:val="20"/>
+          <w:szCs w:val="20"/>
+        </w:rPr>
+      </w:pPr>
+      <w:r>
+        <w:rPr>
+          <w:sz w:val="20"/>
+          <w:szCs w:val="20"/>
+        </w:rPr>
         <w:t>CAN Bus</w:t>
       </w:r>
       <w:r>
+        <w:rPr>
+          <w:sz w:val="20"/>
+          <w:szCs w:val="20"/>
+        </w:rPr>
         <w:t>.</w:t>
       </w:r>
     </w:p>
@@ -9594,8 +10014,16 @@
           <w:ilvl w:val="0"/>
           <w:numId w:val="17"/>
         </w:numPr>
-      </w:pPr>
-      <w:r>
+        <w:rPr>
+          <w:sz w:val="20"/>
+          <w:szCs w:val="20"/>
+        </w:rPr>
+      </w:pPr>
+      <w:r>
+        <w:rPr>
+          <w:sz w:val="20"/>
+          <w:szCs w:val="20"/>
+        </w:rPr>
         <w:t>Stereo line-In / headphones out</w:t>
       </w:r>
     </w:p>
@@ -9606,9 +10034,16 @@
           <w:ilvl w:val="0"/>
           <w:numId w:val="17"/>
         </w:numPr>
-      </w:pPr>
-      <w:r>
-        <w:lastRenderedPageBreak/>
+        <w:rPr>
+          <w:sz w:val="20"/>
+          <w:szCs w:val="20"/>
+        </w:rPr>
+      </w:pPr>
+      <w:r>
+        <w:rPr>
+          <w:sz w:val="20"/>
+          <w:szCs w:val="20"/>
+        </w:rPr>
         <w:t>Digital microphone</w:t>
       </w:r>
     </w:p>
@@ -9619,8 +10054,16 @@
           <w:ilvl w:val="0"/>
           <w:numId w:val="17"/>
         </w:numPr>
-      </w:pPr>
-      <w:r>
+        <w:rPr>
+          <w:sz w:val="20"/>
+          <w:szCs w:val="20"/>
+        </w:rPr>
+      </w:pPr>
+      <w:r>
+        <w:rPr>
+          <w:sz w:val="20"/>
+          <w:szCs w:val="20"/>
+        </w:rPr>
         <w:t>Single 3.3 V power supply</w:t>
       </w:r>
     </w:p>
@@ -9631,8 +10074,16 @@
           <w:ilvl w:val="0"/>
           <w:numId w:val="17"/>
         </w:numPr>
-      </w:pPr>
-      <w:r>
+        <w:rPr>
+          <w:sz w:val="20"/>
+          <w:szCs w:val="20"/>
+        </w:rPr>
+      </w:pPr>
+      <w:r>
+        <w:rPr>
+          <w:sz w:val="20"/>
+          <w:szCs w:val="20"/>
+        </w:rPr>
         <w:t>67mm x 51mm, 200 pin SO-DIMM Connector</w:t>
       </w:r>
     </w:p>
@@ -9652,11 +10103,23 @@
         <w:rPr>
           <w:color w:val="0000CC"/>
         </w:rPr>
+        <w:lastRenderedPageBreak/>
         <w:t>Advantages over G4418 module:</w:t>
       </w:r>
     </w:p>
     <w:p>
-      <w:r>
+      <w:pPr>
+        <w:ind w:left="360"/>
+        <w:rPr>
+          <w:sz w:val="20"/>
+          <w:szCs w:val="20"/>
+        </w:rPr>
+      </w:pPr>
+      <w:r>
+        <w:rPr>
+          <w:sz w:val="20"/>
+          <w:szCs w:val="20"/>
+        </w:rPr>
         <w:t>Here are some plus points of using the Var-SoM-MX6:</w:t>
       </w:r>
     </w:p>
@@ -9667,35 +10130,49 @@
           <w:ilvl w:val="0"/>
           <w:numId w:val="19"/>
         </w:numPr>
-      </w:pPr>
-      <w:r>
+        <w:rPr>
+          <w:sz w:val="20"/>
+          <w:szCs w:val="20"/>
+        </w:rPr>
+      </w:pPr>
+      <w:r>
+        <w:rPr>
+          <w:sz w:val="20"/>
+          <w:szCs w:val="20"/>
+        </w:rPr>
         <w:t xml:space="preserve">The module has </w:t>
       </w:r>
       <w:r>
         <w:rPr>
           <w:b/>
           <w:bCs/>
+          <w:sz w:val="20"/>
+          <w:szCs w:val="20"/>
         </w:rPr>
         <w:t>TLV320AIC3106</w:t>
       </w:r>
       <w:r>
+        <w:rPr>
+          <w:sz w:val="20"/>
+          <w:szCs w:val="20"/>
+        </w:rPr>
         <w:t xml:space="preserve"> which is a low-power, highly integrated stereo </w:t>
       </w:r>
       <w:r>
         <w:rPr>
           <w:b/>
           <w:bCs/>
+          <w:sz w:val="20"/>
+          <w:szCs w:val="20"/>
         </w:rPr>
         <w:t>audio codec</w:t>
       </w:r>
       <w:r>
-        <w:t xml:space="preserve"> with stereo headphone amplifier, as well as multiple inputs and outputs programmable in single-ended or fully differential configurations</w:t>
-      </w:r>
-      <w:r>
-        <w:t xml:space="preserve"> </w:t>
-      </w:r>
-      <w:r>
-        <w:t>The VAR-SOM-MX6 exposes the following interface of the TLV320AIC3106:</w:t>
+        <w:rPr>
+          <w:sz w:val="20"/>
+          <w:szCs w:val="20"/>
+        </w:rPr>
+        <w:t xml:space="preserve"> with stereo headphone amplifier, as well as multiple inputs and outputs programmable in single-ended or fully differential configurations The VAR-SOM-MX6 exposes the following interface of the TLV320AIC3106:</w:t>
       </w:r>
     </w:p>
     <w:p>
@@ -9708,11 +10185,15 @@
         <w:ind w:left="1170"/>
         <w:rPr>
           <w:color w:val="000000" w:themeColor="text1"/>
+          <w:sz w:val="20"/>
+          <w:szCs w:val="20"/>
         </w:rPr>
       </w:pPr>
       <w:r>
         <w:rPr>
           <w:color w:val="000000" w:themeColor="text1"/>
+          <w:sz w:val="20"/>
+          <w:szCs w:val="20"/>
         </w:rPr>
         <w:t>Headphone</w:t>
       </w:r>
@@ -9727,11 +10208,15 @@
         <w:ind w:left="1170"/>
         <w:rPr>
           <w:color w:val="000000" w:themeColor="text1"/>
+          <w:sz w:val="20"/>
+          <w:szCs w:val="20"/>
         </w:rPr>
       </w:pPr>
       <w:r>
         <w:rPr>
           <w:color w:val="000000" w:themeColor="text1"/>
+          <w:sz w:val="20"/>
+          <w:szCs w:val="20"/>
         </w:rPr>
         <w:t>Line-in</w:t>
       </w:r>
@@ -9746,11 +10231,15 @@
         <w:ind w:left="1170"/>
         <w:rPr>
           <w:color w:val="000000" w:themeColor="text1"/>
+          <w:sz w:val="20"/>
+          <w:szCs w:val="20"/>
         </w:rPr>
       </w:pPr>
       <w:r>
         <w:rPr>
           <w:color w:val="000000" w:themeColor="text1"/>
+          <w:sz w:val="20"/>
+          <w:szCs w:val="20"/>
         </w:rPr>
         <w:t>Digital microphone</w:t>
       </w:r>
@@ -9762,19 +10251,60 @@
           <w:ilvl w:val="0"/>
           <w:numId w:val="19"/>
         </w:numPr>
-      </w:pPr>
-      <w:r>
+        <w:rPr>
+          <w:sz w:val="20"/>
+          <w:szCs w:val="20"/>
+        </w:rPr>
+      </w:pPr>
+      <w:r>
+        <w:rPr>
+          <w:sz w:val="20"/>
+          <w:szCs w:val="20"/>
+        </w:rPr>
         <w:t xml:space="preserve">The VAR-SOM-MX6 contains TI’s </w:t>
       </w:r>
       <w:r>
         <w:rPr>
           <w:b/>
           <w:bCs/>
-        </w:rPr>
-        <w:t>WL183xMOD WiLink</w:t>
-      </w:r>
-      <w:r>
-        <w:t>, a high performance 2.4/5 GHz IEEE 802.11 a/b/g/n Bluetooth 4.1/BLE with CSA2 support radio module, with optional Dual Band and MIMO support. The modules support improved performance over WiFi in bit rates reaching 100Mbps (UDP) and 80Mbps (TCP).</w:t>
+          <w:sz w:val="20"/>
+          <w:szCs w:val="20"/>
+        </w:rPr>
+        <w:t xml:space="preserve">WL183xMOD </w:t>
+      </w:r>
+      <w:proofErr w:type="spellStart"/>
+      <w:r>
+        <w:rPr>
+          <w:b/>
+          <w:bCs/>
+          <w:sz w:val="20"/>
+          <w:szCs w:val="20"/>
+        </w:rPr>
+        <w:t>WiLink</w:t>
+      </w:r>
+      <w:proofErr w:type="spellEnd"/>
+      <w:r>
+        <w:rPr>
+          <w:sz w:val="20"/>
+          <w:szCs w:val="20"/>
+        </w:rPr>
+        <w:t xml:space="preserve">, a high performance 2.4/5 GHz IEEE 802.11 a/b/g/n Bluetooth 4.1/BLE with CSA2 support radio module, with optional Dual Band and MIMO support. The modules support improved performance over </w:t>
+      </w:r>
+      <w:proofErr w:type="spellStart"/>
+      <w:r>
+        <w:rPr>
+          <w:sz w:val="20"/>
+          <w:szCs w:val="20"/>
+        </w:rPr>
+        <w:t>WiFi</w:t>
+      </w:r>
+      <w:proofErr w:type="spellEnd"/>
+      <w:r>
+        <w:rPr>
+          <w:sz w:val="20"/>
+          <w:szCs w:val="20"/>
+        </w:rPr>
+        <w:t xml:space="preserve"> in bit rates reaching 100Mbps (UDP) and 80Mbps (TCP).</w:t>
       </w:r>
     </w:p>
     <w:p>
@@ -9784,35 +10314,65 @@
           <w:ilvl w:val="0"/>
           <w:numId w:val="19"/>
         </w:numPr>
-      </w:pPr>
-      <w:r>
+        <w:rPr>
+          <w:sz w:val="20"/>
+          <w:szCs w:val="20"/>
+        </w:rPr>
+      </w:pPr>
+      <w:r>
+        <w:rPr>
+          <w:sz w:val="20"/>
+          <w:szCs w:val="20"/>
+        </w:rPr>
         <w:t xml:space="preserve">The VAR-SOM-MX6 features Freescale’s </w:t>
       </w:r>
       <w:r>
         <w:rPr>
           <w:b/>
           <w:bCs/>
+          <w:sz w:val="20"/>
+          <w:szCs w:val="20"/>
         </w:rPr>
         <w:t>PMPF0100</w:t>
       </w:r>
       <w:r>
-        <w:t xml:space="preserve"> as a Power Management Integrated circuit (PMIC) which regulates all power rails required on SoM from a </w:t>
+        <w:rPr>
+          <w:sz w:val="20"/>
+          <w:szCs w:val="20"/>
+        </w:rPr>
+        <w:t xml:space="preserve"> as a Power Management Integrated circuit (PMIC) which regulates all power rails required on </w:t>
+      </w:r>
+      <w:proofErr w:type="spellStart"/>
+      <w:r>
+        <w:rPr>
+          <w:sz w:val="20"/>
+          <w:szCs w:val="20"/>
+        </w:rPr>
+        <w:t>SoM</w:t>
+      </w:r>
+      <w:proofErr w:type="spellEnd"/>
+      <w:r>
+        <w:rPr>
+          <w:sz w:val="20"/>
+          <w:szCs w:val="20"/>
+        </w:rPr>
+        <w:t xml:space="preserve"> from a </w:t>
       </w:r>
       <w:r>
         <w:rPr>
           <w:b/>
           <w:bCs/>
+          <w:sz w:val="20"/>
+          <w:szCs w:val="20"/>
         </w:rPr>
         <w:t>single 3.3 V power supply</w:t>
       </w:r>
       <w:r>
-        <w:t>.</w:t>
-      </w:r>
-      <w:r>
-        <w:t xml:space="preserve"> </w:t>
-      </w:r>
-      <w:r>
-        <w:t>The PMIC is fully programmable via the I2C interface.</w:t>
+        <w:rPr>
+          <w:sz w:val="20"/>
+          <w:szCs w:val="20"/>
+        </w:rPr>
+        <w:t>. The PMIC is fully programmable via the I2C interface.</w:t>
       </w:r>
     </w:p>
     <w:p>
@@ -9822,8 +10382,16 @@
           <w:ilvl w:val="0"/>
           <w:numId w:val="19"/>
         </w:numPr>
-      </w:pPr>
-      <w:r>
+        <w:rPr>
+          <w:sz w:val="20"/>
+          <w:szCs w:val="20"/>
+        </w:rPr>
+      </w:pPr>
+      <w:r>
+        <w:rPr>
+          <w:sz w:val="20"/>
+          <w:szCs w:val="20"/>
+        </w:rPr>
         <w:t>The VAR-SOM-MX6 exposes a 200-pin SO–DIMM mechanical standard interface. The recommended mating connector for baseboard interfacing are:</w:t>
       </w:r>
     </w:p>
@@ -9831,8 +10399,16 @@
       <w:pPr>
         <w:pStyle w:val="ListParagraph"/>
         <w:ind w:left="810"/>
-      </w:pPr>
-      <w:r>
+        <w:rPr>
+          <w:sz w:val="20"/>
+          <w:szCs w:val="20"/>
+        </w:rPr>
+      </w:pPr>
+      <w:r>
+        <w:rPr>
+          <w:sz w:val="20"/>
+          <w:szCs w:val="20"/>
+        </w:rPr>
         <w:t>1. CONCRAFT - 0701A0BE52E</w:t>
       </w:r>
     </w:p>
@@ -9840,22 +10416,46 @@
       <w:pPr>
         <w:pStyle w:val="ListParagraph"/>
         <w:ind w:left="810"/>
-      </w:pPr>
-      <w:r>
+        <w:rPr>
+          <w:sz w:val="20"/>
+          <w:szCs w:val="20"/>
+        </w:rPr>
+      </w:pPr>
+      <w:r>
+        <w:rPr>
+          <w:sz w:val="20"/>
+          <w:szCs w:val="20"/>
+        </w:rPr>
         <w:t>2. Tyco Electronics-1565917-4</w:t>
       </w:r>
     </w:p>
     <w:p>
       <w:pPr>
         <w:pStyle w:val="ListParagraph"/>
-      </w:pPr>
-      <w:r>
+        <w:rPr>
+          <w:sz w:val="20"/>
+          <w:szCs w:val="20"/>
+        </w:rPr>
+      </w:pPr>
+      <w:r>
+        <w:rPr>
+          <w:sz w:val="20"/>
+          <w:szCs w:val="20"/>
+        </w:rPr>
         <w:t>In addition to the 200-pin SO-DIMM interface VAR-SOM-MX6 exposes a 40-pin FFC connector.</w:t>
       </w:r>
       <w:r>
+        <w:rPr>
+          <w:sz w:val="20"/>
+          <w:szCs w:val="20"/>
+        </w:rPr>
         <w:t xml:space="preserve"> </w:t>
       </w:r>
       <w:r>
+        <w:rPr>
+          <w:sz w:val="20"/>
+          <w:szCs w:val="20"/>
+        </w:rPr>
         <w:t>The recommended mating cable is Molex 21020-0427 or equivalent.</w:t>
       </w:r>
     </w:p>
@@ -9866,19 +10466,49 @@
           <w:ilvl w:val="0"/>
           <w:numId w:val="21"/>
         </w:numPr>
-      </w:pPr>
-      <w:r>
+        <w:rPr>
+          <w:sz w:val="20"/>
+          <w:szCs w:val="20"/>
+        </w:rPr>
+      </w:pPr>
+      <w:r>
+        <w:rPr>
+          <w:sz w:val="20"/>
+          <w:szCs w:val="20"/>
+        </w:rPr>
         <w:t xml:space="preserve">The VAR-SOM-MX6 features a </w:t>
       </w:r>
       <w:r>
         <w:rPr>
           <w:b/>
           <w:bCs/>
+          <w:sz w:val="20"/>
+          <w:szCs w:val="20"/>
         </w:rPr>
         <w:t>4-wire resistive touch panel</w:t>
       </w:r>
       <w:r>
-        <w:t xml:space="preserve"> interface which is compatible with 4-wire resistive touch screens, pen-detection and nIRQ generation and supports several schemes of measurement, averaging to filter noise.</w:t>
+        <w:rPr>
+          <w:sz w:val="20"/>
+          <w:szCs w:val="20"/>
+        </w:rPr>
+        <w:t xml:space="preserve"> interface which is compatible with 4-wire resistive touch screens, pen-detection and </w:t>
+      </w:r>
+      <w:proofErr w:type="spellStart"/>
+      <w:r>
+        <w:rPr>
+          <w:sz w:val="20"/>
+          <w:szCs w:val="20"/>
+        </w:rPr>
+        <w:t>nIRQ</w:t>
+      </w:r>
+      <w:proofErr w:type="spellEnd"/>
+      <w:r>
+        <w:rPr>
+          <w:sz w:val="20"/>
+          <w:szCs w:val="20"/>
+        </w:rPr>
+        <w:t xml:space="preserve"> generation and supports several schemes of measurement, averaging to filter noise.</w:t>
       </w:r>
     </w:p>
     <w:p>
@@ -9888,24 +10518,33 @@
           <w:ilvl w:val="0"/>
           <w:numId w:val="21"/>
         </w:numPr>
-      </w:pPr>
-      <w:r>
-        <w:t xml:space="preserve">The SoM supports JTAG for </w:t>
-      </w:r>
-      <w:r>
-        <w:t>debug</w:t>
-      </w:r>
-      <w:r>
-        <w:t>ging</w:t>
-      </w:r>
-      <w:r>
-        <w:t xml:space="preserve"> and test control</w:t>
-      </w:r>
-      <w:r>
-        <w:t>ling</w:t>
-      </w:r>
-      <w:r>
-        <w:t xml:space="preserve"> with maximum security</w:t>
+        <w:rPr>
+          <w:sz w:val="20"/>
+          <w:szCs w:val="20"/>
+        </w:rPr>
+      </w:pPr>
+      <w:r>
+        <w:rPr>
+          <w:sz w:val="20"/>
+          <w:szCs w:val="20"/>
+        </w:rPr>
+        <w:t xml:space="preserve">The </w:t>
+      </w:r>
+      <w:proofErr w:type="spellStart"/>
+      <w:r>
+        <w:rPr>
+          <w:sz w:val="20"/>
+          <w:szCs w:val="20"/>
+        </w:rPr>
+        <w:t>SoM</w:t>
+      </w:r>
+      <w:proofErr w:type="spellEnd"/>
+      <w:r>
+        <w:rPr>
+          <w:sz w:val="20"/>
+          <w:szCs w:val="20"/>
+        </w:rPr>
+        <w:t xml:space="preserve"> supports JTAG for debugging and test controlling with maximum security</w:t>
       </w:r>
     </w:p>
     <w:p>
@@ -9915,44 +10554,84 @@
           <w:ilvl w:val="0"/>
           <w:numId w:val="21"/>
         </w:numPr>
-      </w:pPr>
-      <w:r>
+        <w:rPr>
+          <w:sz w:val="20"/>
+          <w:szCs w:val="20"/>
+        </w:rPr>
+      </w:pPr>
+      <w:r>
+        <w:rPr>
+          <w:sz w:val="20"/>
+          <w:szCs w:val="20"/>
+        </w:rPr>
         <w:t xml:space="preserve">It has a </w:t>
       </w:r>
       <w:r>
         <w:rPr>
           <w:b/>
           <w:bCs/>
+          <w:sz w:val="20"/>
+          <w:szCs w:val="20"/>
         </w:rPr>
         <w:t>4GB of DDR3</w:t>
       </w:r>
       <w:r>
+        <w:rPr>
+          <w:sz w:val="20"/>
+          <w:szCs w:val="20"/>
+        </w:rPr>
         <w:t xml:space="preserve"> compared to a 1GB DDR3 of G4418 and a </w:t>
       </w:r>
       <w:r>
         <w:rPr>
           <w:b/>
           <w:bCs/>
-        </w:rPr>
-        <w:t xml:space="preserve">64GB eMMc </w:t>
-      </w:r>
-      <w:r>
-        <w:t>compared to 8GB in G4418.</w:t>
-      </w:r>
-      <w:r>
+          <w:sz w:val="20"/>
+          <w:szCs w:val="20"/>
+        </w:rPr>
+        <w:t xml:space="preserve">64GB </w:t>
+      </w:r>
+      <w:proofErr w:type="spellStart"/>
+      <w:r>
+        <w:rPr>
+          <w:b/>
+          <w:bCs/>
+          <w:sz w:val="20"/>
+          <w:szCs w:val="20"/>
+        </w:rPr>
+        <w:t>eMMc</w:t>
+      </w:r>
+      <w:proofErr w:type="spellEnd"/>
+      <w:r>
+        <w:rPr>
+          <w:b/>
+          <w:bCs/>
+          <w:sz w:val="20"/>
+          <w:szCs w:val="20"/>
+        </w:rPr>
         <w:t xml:space="preserve"> </w:t>
       </w:r>
       <w:r>
-        <w:t xml:space="preserve">: The VAR-SOM-MX6 is available with up to </w:t>
+        <w:rPr>
+          <w:sz w:val="20"/>
+          <w:szCs w:val="20"/>
+        </w:rPr>
+        <w:t xml:space="preserve">compared to 8GB in G4418. : The VAR-SOM-MX6 is available with up to </w:t>
       </w:r>
       <w:r>
         <w:rPr>
           <w:b/>
           <w:bCs/>
+          <w:sz w:val="20"/>
+          <w:szCs w:val="20"/>
         </w:rPr>
         <w:t>1GB of SLC NAND FLASH memory</w:t>
       </w:r>
       <w:r>
+        <w:rPr>
+          <w:sz w:val="20"/>
+          <w:szCs w:val="20"/>
+        </w:rPr>
         <w:t>.</w:t>
       </w:r>
     </w:p>
@@ -10006,65 +10685,40 @@
       </w:r>
     </w:p>
     <w:p>
-      <w:r>
-        <w:t>UCM-iMX8</w:t>
-      </w:r>
-      <w:r>
-        <w:t xml:space="preserve"> is an u</w:t>
-      </w:r>
-      <w:r>
-        <w:t>ltra-miniature</w:t>
-      </w:r>
-      <w:r>
-        <w:t xml:space="preserve"> form-factor and </w:t>
-      </w:r>
-      <w:r>
-        <w:t>high</w:t>
-      </w:r>
-      <w:r>
-        <w:t xml:space="preserve"> efficiency</w:t>
-      </w:r>
-      <w:r>
-        <w:t xml:space="preserve"> module which is i</w:t>
-      </w:r>
-      <w:r>
-        <w:t>deal for space constrained and portable systems</w:t>
-      </w:r>
-      <w:r>
-        <w:t>.</w:t>
-      </w:r>
-      <w:r>
-        <w:t xml:space="preserve"> The module uses</w:t>
-      </w:r>
-      <w:r>
-        <w:t xml:space="preserve"> i.MX 8M family of processors features advanced implementation of a quad ARM® Cortex®-</w:t>
-      </w:r>
-      <w:r>
-        <w:t xml:space="preserve"> </w:t>
-      </w:r>
-      <w:r>
-        <w:t>A53 core, which</w:t>
-      </w:r>
-      <w:r>
-        <w:t xml:space="preserve"> </w:t>
-      </w:r>
-      <w:r>
-        <w:t xml:space="preserve">operates at speeds of up to 1.5 GHz. A </w:t>
-      </w:r>
-      <w:r>
+      <w:pPr>
+        <w:ind w:left="360"/>
+        <w:rPr>
+          <w:sz w:val="20"/>
+          <w:szCs w:val="20"/>
+        </w:rPr>
+      </w:pPr>
+      <w:r>
+        <w:rPr>
+          <w:sz w:val="20"/>
+          <w:szCs w:val="20"/>
+        </w:rPr>
+        <w:t>UCM-iMX8 is an ultra-miniature form-factor and high efficiency module which is ideal for space constrained and portable systems.</w:t>
+      </w:r>
+      <w:r>
+        <w:rPr>
+          <w:sz w:val="20"/>
+          <w:szCs w:val="20"/>
+        </w:rPr>
+        <w:t xml:space="preserve"> The module uses i.MX 8M family of processors features advanced implementation of a quad ARM® Cortex®- A53 core, which operates at speeds of up to 1.5 GHz. A </w:t>
+      </w:r>
+      <w:r>
+        <w:rPr>
+          <w:sz w:val="20"/>
+          <w:szCs w:val="20"/>
+        </w:rPr>
         <w:t>general-purpose</w:t>
       </w:r>
       <w:r>
-        <w:t xml:space="preserve"> Cortex®-M4 core</w:t>
-      </w:r>
-      <w:r>
-        <w:t xml:space="preserve"> </w:t>
-      </w:r>
-      <w:r>
-        <w:t>processor is for low-power processing</w:t>
-      </w:r>
-      <w:r>
-        <w:t>.</w:t>
+        <w:rPr>
+          <w:sz w:val="20"/>
+          <w:szCs w:val="20"/>
+        </w:rPr>
+        <w:t xml:space="preserve"> Cortex®-M4 core processor is for low-power processing.</w:t>
       </w:r>
     </w:p>
     <w:p>
@@ -10082,7 +10736,6 @@
         <w:rPr>
           <w:color w:val="0000CC"/>
         </w:rPr>
-        <w:lastRenderedPageBreak/>
         <w:t>Key Features:</w:t>
       </w:r>
     </w:p>
@@ -10183,8 +10836,16 @@
               <w:rPr>
                 <w:rFonts w:asciiTheme="majorHAnsi" w:hAnsiTheme="majorHAnsi" w:cstheme="majorHAnsi"/>
               </w:rPr>
-              <w:t>ARM Cortex-A53 MPCore</w:t>
-            </w:r>
+              <w:t xml:space="preserve">ARM Cortex-A53 </w:t>
+            </w:r>
+            <w:proofErr w:type="spellStart"/>
+            <w:r>
+              <w:rPr>
+                <w:rFonts w:asciiTheme="majorHAnsi" w:hAnsiTheme="majorHAnsi" w:cstheme="majorHAnsi"/>
+              </w:rPr>
+              <w:t>MPCore</w:t>
+            </w:r>
+            <w:proofErr w:type="spellEnd"/>
             <w:r>
               <w:rPr>
                 <w:rFonts w:asciiTheme="majorHAnsi" w:hAnsiTheme="majorHAnsi" w:cstheme="majorHAnsi"/>
@@ -10304,12 +10965,14 @@
                 <w:rFonts w:asciiTheme="majorHAnsi" w:hAnsiTheme="majorHAnsi" w:cstheme="majorHAnsi"/>
               </w:rPr>
             </w:pPr>
+            <w:proofErr w:type="spellStart"/>
             <w:r>
               <w:rPr>
                 <w:rFonts w:asciiTheme="majorHAnsi" w:hAnsiTheme="majorHAnsi" w:cstheme="majorHAnsi"/>
               </w:rPr>
               <w:t>eMMc</w:t>
             </w:r>
+            <w:proofErr w:type="spellEnd"/>
           </w:p>
         </w:tc>
         <w:tc>
@@ -10375,11 +11038,19 @@
               </w:rPr>
               <w:t xml:space="preserve">, </w:t>
             </w:r>
+            <w:proofErr w:type="spellStart"/>
             <w:r>
               <w:rPr>
                 <w:rFonts w:asciiTheme="majorHAnsi" w:hAnsiTheme="majorHAnsi" w:cstheme="majorHAnsi"/>
               </w:rPr>
-              <w:t>WiFi 802.11ac, BT 4.1</w:t>
+              <w:t>WiFi</w:t>
+            </w:r>
+            <w:proofErr w:type="spellEnd"/>
+            <w:r>
+              <w:rPr>
+                <w:rFonts w:asciiTheme="majorHAnsi" w:hAnsiTheme="majorHAnsi" w:cstheme="majorHAnsi"/>
+              </w:rPr>
+              <w:t xml:space="preserve"> 802.11ac, BT 4.1</w:t>
             </w:r>
           </w:p>
         </w:tc>
@@ -10400,8 +11071,16 @@
               <w:rPr>
                 <w:rFonts w:asciiTheme="majorHAnsi" w:hAnsiTheme="majorHAnsi" w:cstheme="majorHAnsi"/>
               </w:rPr>
-              <w:t>I/Os</w:t>
-            </w:r>
+              <w:t>I/</w:t>
+            </w:r>
+            <w:proofErr w:type="spellStart"/>
+            <w:r>
+              <w:rPr>
+                <w:rFonts w:asciiTheme="majorHAnsi" w:hAnsiTheme="majorHAnsi" w:cstheme="majorHAnsi"/>
+              </w:rPr>
+              <w:t>Os</w:t>
+            </w:r>
+            <w:proofErr w:type="spellEnd"/>
           </w:p>
         </w:tc>
         <w:tc>
@@ -10492,6 +11171,7 @@
               <w:rPr>
                 <w:rFonts w:asciiTheme="majorHAnsi" w:hAnsiTheme="majorHAnsi" w:cstheme="majorHAnsi"/>
               </w:rPr>
+              <w:lastRenderedPageBreak/>
               <w:t>System Logic</w:t>
             </w:r>
           </w:p>
@@ -10511,7 +11191,21 @@
               <w:rPr>
                 <w:rFonts w:asciiTheme="majorHAnsi" w:hAnsiTheme="majorHAnsi" w:cstheme="majorHAnsi"/>
               </w:rPr>
-              <w:t>RTC with ext batt and JTAG debug interface</w:t>
+              <w:t xml:space="preserve">RTC with </w:t>
+            </w:r>
+            <w:proofErr w:type="spellStart"/>
+            <w:r>
+              <w:rPr>
+                <w:rFonts w:asciiTheme="majorHAnsi" w:hAnsiTheme="majorHAnsi" w:cstheme="majorHAnsi"/>
+              </w:rPr>
+              <w:t>ext</w:t>
+            </w:r>
+            <w:proofErr w:type="spellEnd"/>
+            <w:r>
+              <w:rPr>
+                <w:rFonts w:asciiTheme="majorHAnsi" w:hAnsiTheme="majorHAnsi" w:cstheme="majorHAnsi"/>
+              </w:rPr>
+              <w:t xml:space="preserve"> batt and JTAG debug interface</w:t>
             </w:r>
           </w:p>
         </w:tc>
@@ -10532,13 +11226,7 @@
               <w:rPr>
                 <w:rFonts w:asciiTheme="majorHAnsi" w:hAnsiTheme="majorHAnsi" w:cstheme="majorHAnsi"/>
               </w:rPr>
-              <w:t>Miniature siz</w:t>
-            </w:r>
-            <w:r>
-              <w:rPr>
-                <w:rFonts w:asciiTheme="majorHAnsi" w:hAnsiTheme="majorHAnsi" w:cstheme="majorHAnsi"/>
-              </w:rPr>
-              <w:t>e</w:t>
+              <w:t>Miniature size</w:t>
             </w:r>
           </w:p>
         </w:tc>
@@ -10590,7 +11278,7 @@
                     <pic:cNvPicPr/>
                   </pic:nvPicPr>
                   <pic:blipFill>
-                    <a:blip r:embed="rId49"/>
+                    <a:blip r:embed="rId53"/>
                     <a:stretch>
                       <a:fillRect/>
                     </a:stretch>
@@ -10658,7 +11346,7 @@
                     <pic:cNvPicPr/>
                   </pic:nvPicPr>
                   <pic:blipFill>
-                    <a:blip r:embed="rId50"/>
+                    <a:blip r:embed="rId54"/>
                     <a:stretch>
                       <a:fillRect/>
                     </a:stretch>
@@ -10699,17 +11387,28 @@
         <w:rPr>
           <w:color w:val="0000CC"/>
         </w:rPr>
-        <w:lastRenderedPageBreak/>
         <w:t>Power supply:</w:t>
       </w:r>
     </w:p>
     <w:p>
-      <w:r>
+      <w:pPr>
+        <w:ind w:left="360"/>
+        <w:rPr>
+          <w:sz w:val="20"/>
+          <w:szCs w:val="20"/>
+        </w:rPr>
+      </w:pPr>
+      <w:r>
+        <w:rPr>
+          <w:sz w:val="20"/>
+          <w:szCs w:val="20"/>
+        </w:rPr>
         <w:t>There are two main signals for input power.</w:t>
       </w:r>
     </w:p>
     <w:p>
       <w:pPr>
+        <w:ind w:left="360"/>
         <w:rPr>
           <w:b/>
           <w:bCs/>
@@ -10728,55 +11427,89 @@
       </w:r>
     </w:p>
     <w:p>
-      <w:r>
-        <w:t>The m</w:t>
-      </w:r>
-      <w:r>
-        <w:t xml:space="preserve">ain power supply voltage </w:t>
+      <w:pPr>
+        <w:ind w:left="360"/>
+        <w:rPr>
+          <w:sz w:val="20"/>
+          <w:szCs w:val="20"/>
+        </w:rPr>
+      </w:pPr>
+      <w:r>
+        <w:rPr>
+          <w:sz w:val="20"/>
+          <w:szCs w:val="20"/>
+        </w:rPr>
+        <w:t xml:space="preserve">The main power supply voltage </w:t>
       </w:r>
       <w:r>
         <w:rPr>
           <w:b/>
           <w:bCs/>
+          <w:sz w:val="20"/>
+          <w:szCs w:val="20"/>
         </w:rPr>
         <w:t>(V_SOM)</w:t>
       </w:r>
       <w:r>
+        <w:rPr>
+          <w:sz w:val="20"/>
+          <w:szCs w:val="20"/>
+        </w:rPr>
         <w:t xml:space="preserve"> of U</w:t>
       </w:r>
       <w:r>
+        <w:rPr>
+          <w:sz w:val="20"/>
+          <w:szCs w:val="20"/>
+        </w:rPr>
         <w:t>C</w:t>
       </w:r>
       <w:r>
+        <w:rPr>
+          <w:sz w:val="20"/>
+          <w:szCs w:val="20"/>
+        </w:rPr>
         <w:t xml:space="preserve">M_iMX8 requires 3.8V to </w:t>
       </w:r>
       <w:r>
+        <w:rPr>
+          <w:sz w:val="20"/>
+          <w:szCs w:val="20"/>
+        </w:rPr>
         <w:t>function</w:t>
       </w:r>
       <w:r>
+        <w:rPr>
+          <w:sz w:val="20"/>
+          <w:szCs w:val="20"/>
+        </w:rPr>
         <w:t>. We can hook it up with a battery directly to provide input power.</w:t>
       </w:r>
       <w:r>
-        <w:t xml:space="preserve"> S</w:t>
-      </w:r>
-      <w:r>
-        <w:t>everal 10/100uF capacitors</w:t>
-      </w:r>
-      <w:r>
-        <w:t xml:space="preserve"> will be connected</w:t>
-      </w:r>
-      <w:r>
-        <w:t xml:space="preserve"> between V_SOM and GND</w:t>
-      </w:r>
-      <w:r>
+        <w:rPr>
+          <w:sz w:val="20"/>
+          <w:szCs w:val="20"/>
+        </w:rPr>
+        <w:t xml:space="preserve"> Several 10/100uF capacitors will be connected between V_SOM and GND</w:t>
+      </w:r>
+      <w:r>
+        <w:rPr>
+          <w:sz w:val="20"/>
+          <w:szCs w:val="20"/>
+        </w:rPr>
         <w:t xml:space="preserve"> </w:t>
       </w:r>
       <w:r>
+        <w:rPr>
+          <w:sz w:val="20"/>
+          <w:szCs w:val="20"/>
+        </w:rPr>
         <w:t>for a stable input signal.</w:t>
       </w:r>
     </w:p>
     <w:p>
       <w:pPr>
+        <w:ind w:left="360"/>
         <w:rPr>
           <w:b/>
           <w:bCs/>
@@ -10795,24 +11528,49 @@
       </w:r>
     </w:p>
     <w:p>
-      <w:r>
+      <w:pPr>
+        <w:ind w:left="360"/>
+      </w:pPr>
+      <w:r>
+        <w:rPr>
+          <w:sz w:val="20"/>
+          <w:szCs w:val="20"/>
+        </w:rPr>
+        <w:lastRenderedPageBreak/>
         <w:t xml:space="preserve">A battery charging circuitry would be required. The RTC requires 3V </w:t>
       </w:r>
       <w:r>
+        <w:rPr>
+          <w:sz w:val="20"/>
+          <w:szCs w:val="20"/>
+        </w:rPr>
         <w:t xml:space="preserve">on </w:t>
       </w:r>
       <w:r>
         <w:rPr>
           <w:b/>
           <w:bCs/>
+          <w:sz w:val="20"/>
+          <w:szCs w:val="20"/>
         </w:rPr>
         <w:t>VCC_RTC</w:t>
       </w:r>
       <w:r>
+        <w:rPr>
+          <w:sz w:val="20"/>
+          <w:szCs w:val="20"/>
+        </w:rPr>
         <w:t xml:space="preserve"> pin which will be provided </w:t>
       </w:r>
       <w:r>
-        <w:t>through an external battery source.</w:t>
+        <w:rPr>
+          <w:sz w:val="20"/>
+          <w:szCs w:val="20"/>
+        </w:rPr>
+        <w:t>through an external battery source</w:t>
+      </w:r>
+      <w:r>
+        <w:t>.</w:t>
       </w:r>
     </w:p>
     <w:p>
@@ -10834,7 +11592,18 @@
       </w:r>
     </w:p>
     <w:p>
-      <w:r>
+      <w:pPr>
+        <w:ind w:left="360"/>
+        <w:rPr>
+          <w:sz w:val="20"/>
+          <w:szCs w:val="20"/>
+        </w:rPr>
+      </w:pPr>
+      <w:r>
+        <w:rPr>
+          <w:sz w:val="20"/>
+          <w:szCs w:val="20"/>
+        </w:rPr>
         <w:t>Here are some plus points of using the Var-SoM-MX6:</w:t>
       </w:r>
     </w:p>
@@ -10845,18 +11614,33 @@
           <w:ilvl w:val="0"/>
           <w:numId w:val="19"/>
         </w:numPr>
-      </w:pPr>
-      <w:r>
-        <w:t>It</w:t>
-      </w:r>
-      <w:r>
-        <w:t xml:space="preserve"> </w:t>
-      </w:r>
-      <w:r>
-        <w:t xml:space="preserve">is equipped with </w:t>
-      </w:r>
-      <w:r>
-        <w:t>WiFi 802.11 a/b/g/n and Bluetooth functionality</w:t>
+        <w:rPr>
+          <w:sz w:val="20"/>
+          <w:szCs w:val="20"/>
+        </w:rPr>
+      </w:pPr>
+      <w:r>
+        <w:rPr>
+          <w:sz w:val="20"/>
+          <w:szCs w:val="20"/>
+        </w:rPr>
+        <w:t xml:space="preserve">It is equipped with </w:t>
+      </w:r>
+      <w:proofErr w:type="spellStart"/>
+      <w:r>
+        <w:rPr>
+          <w:sz w:val="20"/>
+          <w:szCs w:val="20"/>
+        </w:rPr>
+        <w:t>WiFi</w:t>
+      </w:r>
+      <w:proofErr w:type="spellEnd"/>
+      <w:r>
+        <w:rPr>
+          <w:sz w:val="20"/>
+          <w:szCs w:val="20"/>
+        </w:rPr>
+        <w:t xml:space="preserve"> 802.11 a/b/g/n and Bluetooth functionality</w:t>
       </w:r>
     </w:p>
     <w:p>
@@ -10866,8 +11650,16 @@
           <w:ilvl w:val="0"/>
           <w:numId w:val="19"/>
         </w:numPr>
-      </w:pPr>
-      <w:r>
+        <w:rPr>
+          <w:sz w:val="20"/>
+          <w:szCs w:val="20"/>
+        </w:rPr>
+      </w:pPr>
+      <w:r>
+        <w:rPr>
+          <w:sz w:val="20"/>
+          <w:szCs w:val="20"/>
+        </w:rPr>
         <w:t>The board can either be connected to a regulator or battery for 3.8V.</w:t>
       </w:r>
     </w:p>
@@ -10878,8 +11670,16 @@
           <w:ilvl w:val="0"/>
           <w:numId w:val="19"/>
         </w:numPr>
-      </w:pPr>
-      <w:r>
+        <w:rPr>
+          <w:sz w:val="20"/>
+          <w:szCs w:val="20"/>
+        </w:rPr>
+      </w:pPr>
+      <w:r>
+        <w:rPr>
+          <w:sz w:val="20"/>
+          <w:szCs w:val="20"/>
+        </w:rPr>
         <w:t xml:space="preserve"> Extra GPIOs are given. Additional functions can easily be connected.</w:t>
       </w:r>
     </w:p>
@@ -10890,9 +11690,33 @@
           <w:ilvl w:val="0"/>
           <w:numId w:val="19"/>
         </w:numPr>
-      </w:pPr>
-      <w:r>
-        <w:t>It has more memory and RAM than the current module being used in the design. RAM is 4GB and eMMc is 64GB compared to 1GB and 8GB in X4418 board, respectively.</w:t>
+        <w:rPr>
+          <w:sz w:val="20"/>
+          <w:szCs w:val="20"/>
+        </w:rPr>
+      </w:pPr>
+      <w:r>
+        <w:rPr>
+          <w:sz w:val="20"/>
+          <w:szCs w:val="20"/>
+        </w:rPr>
+        <w:t xml:space="preserve">It has more memory and RAM than the current module being used in the design. RAM is 4GB and </w:t>
+      </w:r>
+      <w:proofErr w:type="spellStart"/>
+      <w:r>
+        <w:rPr>
+          <w:sz w:val="20"/>
+          <w:szCs w:val="20"/>
+        </w:rPr>
+        <w:t>eMMc</w:t>
+      </w:r>
+      <w:proofErr w:type="spellEnd"/>
+      <w:r>
+        <w:rPr>
+          <w:sz w:val="20"/>
+          <w:szCs w:val="20"/>
+        </w:rPr>
+        <w:t xml:space="preserve"> is 64GB compared to 1GB and 8GB in X4418 board, respectively.</w:t>
       </w:r>
     </w:p>
     <w:p>
@@ -10902,13 +11726,21 @@
           <w:ilvl w:val="0"/>
           <w:numId w:val="19"/>
         </w:numPr>
-      </w:pPr>
-      <w:r>
+        <w:rPr>
+          <w:sz w:val="20"/>
+          <w:szCs w:val="20"/>
+        </w:rPr>
+      </w:pPr>
+      <w:r>
+        <w:rPr>
+          <w:sz w:val="20"/>
+          <w:szCs w:val="20"/>
+        </w:rPr>
         <w:t>Miniature size reduces the overall size of the PCB allowing for a compact design.</w:t>
       </w:r>
     </w:p>
     <w:sectPr>
-      <w:footerReference w:type="default" r:id="rId51"/>
+      <w:footerReference w:type="default" r:id="rId55"/>
       <w:pgSz w:w="11909" w:h="16834"/>
       <w:pgMar w:top="1440" w:right="1440" w:bottom="1440" w:left="1440" w:header="720" w:footer="720" w:gutter="0"/>
       <w:pgNumType w:start="1"/>

</xml_diff>